<commit_message>
chore: add .gitignore entries, CSS type declarations, and build artifact cleanup
</commit_message>
<xml_diff>
--- a/cahier de recette.docx
+++ b/cahier de recette.docx
@@ -1,6 +1,6 @@
 
 <file path=word/document.xml><?xml version="1.0" encoding="utf-8"?>
-<w:document xmlns:wpc="http://schemas.microsoft.com/office/word/2010/wordprocessingCanvas" xmlns:cx="http://schemas.microsoft.com/office/drawing/2014/chartex" xmlns:cx1="http://schemas.microsoft.com/office/drawing/2015/9/8/chartex" xmlns:cx2="http://schemas.microsoft.com/office/drawing/2015/10/21/chartex" xmlns:cx3="http://schemas.microsoft.com/office/drawing/2016/5/9/chartex" xmlns:cx4="http://schemas.microsoft.com/office/drawing/2016/5/10/chartex" xmlns:cx5="http://schemas.microsoft.com/office/drawing/2016/5/11/chartex" xmlns:cx6="http://schemas.microsoft.com/office/drawing/2016/5/12/chartex" xmlns:cx7="http://schemas.microsoft.com/office/drawing/2016/5/13/chartex" xmlns:cx8="http://schemas.microsoft.com/office/drawing/2016/5/14/chartex" xmlns:mc="http://schemas.openxmlformats.org/markup-compatibility/2006" xmlns:aink="http://schemas.microsoft.com/office/drawing/2016/ink" xmlns:am3d="http://schemas.microsoft.com/office/drawing/2017/model3d" xmlns:o="urn:schemas-microsoft-com:office:office" xmlns:oel="http://schemas.microsoft.com/office/2019/extlst" xmlns:r="http://schemas.openxmlformats.org/officeDocument/2006/relationships" xmlns:m="http://schemas.openxmlformats.org/officeDocument/2006/math" xmlns:v="urn:schemas-microsoft-com:vml" xmlns:wp14="http://schemas.microsoft.com/office/word/2010/wordprocessingDrawing" xmlns:wp="http://schemas.openxmlformats.org/drawingml/2006/wordprocessingDrawing" xmlns:w10="urn:schemas-microsoft-com:office:word" xmlns:w="http://schemas.openxmlformats.org/wordprocessingml/2006/main" xmlns:w14="http://schemas.microsoft.com/office/word/2010/wordml" xmlns:w15="http://schemas.microsoft.com/office/word/2012/wordml" xmlns:w16cex="http://schemas.microsoft.com/office/word/2018/wordml/cex" xmlns:w16cid="http://schemas.microsoft.com/office/word/2016/wordml/cid" xmlns:w16="http://schemas.microsoft.com/office/word/2018/wordml" xmlns:w16du="http://schemas.microsoft.com/office/word/2023/wordml/word16du" xmlns:w16sdtdh="http://schemas.microsoft.com/office/word/2020/wordml/sdtdatahash" xmlns:w16sdtfl="http://schemas.microsoft.com/office/word/2024/wordml/sdtformatlock" xmlns:w16se="http://schemas.microsoft.com/office/word/2015/wordml/symex" xmlns:wpg="http://schemas.microsoft.com/office/word/2010/wordprocessingGroup" xmlns:wpi="http://schemas.microsoft.com/office/word/2010/wordprocessingInk" xmlns:wne="http://schemas.microsoft.com/office/word/2006/wordml" xmlns:wps="http://schemas.microsoft.com/office/word/2010/wordprocessingShape" mc:Ignorable="w14 w15 w16se w16cid w16 w16cex w16sdtdh w16sdtfl w16du wp14">
+<w:document xmlns:wpc="http://schemas.microsoft.com/office/word/2010/wordprocessingCanvas" xmlns:cx="http://schemas.microsoft.com/office/drawing/2014/chartex" xmlns:cx1="http://schemas.microsoft.com/office/drawing/2015/9/8/chartex" xmlns:mc="http://schemas.openxmlformats.org/markup-compatibility/2006" xmlns:o="urn:schemas-microsoft-com:office:office" xmlns:r="http://schemas.openxmlformats.org/officeDocument/2006/relationships" xmlns:m="http://schemas.openxmlformats.org/officeDocument/2006/math" xmlns:v="urn:schemas-microsoft-com:vml" xmlns:wp14="http://schemas.microsoft.com/office/word/2010/wordprocessingDrawing" xmlns:wp="http://schemas.openxmlformats.org/drawingml/2006/wordprocessingDrawing" xmlns:w10="urn:schemas-microsoft-com:office:word" xmlns:w="http://schemas.openxmlformats.org/wordprocessingml/2006/main" xmlns:w14="http://schemas.microsoft.com/office/word/2010/wordml" xmlns:w15="http://schemas.microsoft.com/office/word/2012/wordml" xmlns:w16se="http://schemas.microsoft.com/office/word/2015/wordml/symex" xmlns:wpg="http://schemas.microsoft.com/office/word/2010/wordprocessingGroup" xmlns:wpi="http://schemas.microsoft.com/office/word/2010/wordprocessingInk" xmlns:wne="http://schemas.microsoft.com/office/word/2006/wordml" xmlns:wps="http://schemas.microsoft.com/office/word/2010/wordprocessingShape" mc:Ignorable="w14 w15 w16se wp14">
   <w:body>
     <w:p>
       <w:pPr>
@@ -10,7 +10,6 @@
           <w:bCs/>
           <w:sz w:val="72"/>
           <w:szCs w:val="72"/>
-          <w:lang w:val="en-US"/>
         </w:rPr>
       </w:pPr>
     </w:p>
@@ -22,7 +21,6 @@
           <w:bCs/>
           <w:sz w:val="72"/>
           <w:szCs w:val="72"/>
-          <w:lang w:val="en-US"/>
         </w:rPr>
       </w:pPr>
     </w:p>
@@ -34,7 +32,6 @@
           <w:bCs/>
           <w:sz w:val="72"/>
           <w:szCs w:val="72"/>
-          <w:lang w:val="en-US"/>
         </w:rPr>
       </w:pPr>
     </w:p>
@@ -46,7 +43,6 @@
           <w:bCs/>
           <w:sz w:val="72"/>
           <w:szCs w:val="72"/>
-          <w:lang w:val="en-US"/>
         </w:rPr>
       </w:pPr>
     </w:p>
@@ -58,7 +54,6 @@
           <w:bCs/>
           <w:sz w:val="72"/>
           <w:szCs w:val="72"/>
-          <w:lang w:val="en-US"/>
         </w:rPr>
       </w:pPr>
     </w:p>
@@ -70,7 +65,7 @@
           <w:bCs/>
           <w:sz w:val="72"/>
           <w:szCs w:val="72"/>
-          <w:lang w:val="en-US"/>
+          <w:lang w:val="fr-FR"/>
         </w:rPr>
       </w:pPr>
       <w:r>
@@ -79,60 +74,76 @@
           <w:bCs/>
           <w:sz w:val="72"/>
           <w:szCs w:val="72"/>
-        </w:rPr>
-        <w:t xml:space="preserve">Cahier de Recette </w:t>
-      </w:r>
+          <w:lang w:val="fr-FR"/>
+        </w:rPr>
+        <w:t xml:space="preserve">Cahier de Recette - Application de Suivi Budgétaire Lycée </w:t>
+      </w:r>
+      <w:proofErr w:type="spellStart"/>
       <w:r>
         <w:rPr>
           <w:b/>
           <w:bCs/>
           <w:sz w:val="72"/>
           <w:szCs w:val="72"/>
-          <w:lang w:val="en-US"/>
-        </w:rPr>
-        <w:t xml:space="preserve">- </w:t>
-      </w:r>
-      <w:r>
+          <w:lang w:val="fr-FR"/>
+        </w:rPr>
+        <w:t>Raombana</w:t>
+      </w:r>
+      <w:proofErr w:type="spellEnd"/>
+    </w:p>
+    <w:p>
+      <w:pPr>
+        <w:jc w:val="center"/>
         <w:rPr>
           <w:b/>
           <w:bCs/>
           <w:sz w:val="72"/>
           <w:szCs w:val="72"/>
-        </w:rPr>
-        <w:t>Application de Suivi Budgétaire Lycée Raombana</w:t>
-      </w:r>
+          <w:lang w:val="fr-FR"/>
+        </w:rPr>
+      </w:pPr>
     </w:p>
     <w:p>
       <w:pPr>
         <w:jc w:val="center"/>
         <w:rPr>
-          <w:b/>
-          <w:bCs/>
-          <w:sz w:val="72"/>
-          <w:szCs w:val="72"/>
-          <w:lang w:val="en-US"/>
+          <w:lang w:val="fr-FR"/>
         </w:rPr>
       </w:pPr>
     </w:p>
     <w:p>
       <w:pPr>
-        <w:jc w:val="center"/>
-        <w:rPr>
-          <w:lang w:val="en-US"/>
-        </w:rPr>
-      </w:pPr>
+        <w:rPr>
+          <w:lang w:val="fr-FR"/>
+        </w:rPr>
+      </w:pPr>
+      <w:r>
+        <w:rPr>
+          <w:lang w:val="fr-FR"/>
+        </w:rPr>
+        <w:br w:type="page"/>
+      </w:r>
     </w:p>
     <w:p>
       <w:pPr>
         <w:rPr>
-          <w:lang w:val="en-US"/>
-        </w:rPr>
-      </w:pPr>
-      <w:r>
-        <w:rPr>
-          <w:lang w:val="en-US"/>
-        </w:rPr>
-        <w:br w:type="page"/>
+          <w:b/>
+          <w:bCs/>
+          <w:sz w:val="28"/>
+          <w:szCs w:val="28"/>
+          <w:lang w:val="fr-FR"/>
+        </w:rPr>
+      </w:pPr>
+      <w:r>
+        <w:rPr>
+          <w:b/>
+          <w:bCs/>
+          <w:sz w:val="28"/>
+          <w:szCs w:val="28"/>
+          <w:lang w:val="fr-FR"/>
+        </w:rPr>
+        <w:lastRenderedPageBreak/>
+        <w:t>Introduction</w:t>
       </w:r>
     </w:p>
     <w:p>
@@ -140,57 +151,63 @@
         <w:rPr>
           <w:b/>
           <w:bCs/>
-          <w:sz w:val="28"/>
-          <w:szCs w:val="28"/>
-          <w:lang w:val="en-US"/>
-        </w:rPr>
-      </w:pPr>
-      <w:r>
-        <w:rPr>
-          <w:b/>
-          <w:bCs/>
-          <w:sz w:val="28"/>
-          <w:szCs w:val="28"/>
-          <w:lang w:val="en-US"/>
-        </w:rPr>
-        <w:lastRenderedPageBreak/>
-        <w:t>Introduction</w:t>
+          <w:lang w:val="fr-FR"/>
+        </w:rPr>
+      </w:pPr>
+      <w:r>
+        <w:rPr>
+          <w:b/>
+          <w:bCs/>
+          <w:lang w:val="fr-FR"/>
+        </w:rPr>
+        <w:t>Objet du document</w:t>
       </w:r>
     </w:p>
     <w:p>
       <w:pPr>
         <w:rPr>
-          <w:b/>
-          <w:bCs/>
-        </w:rPr>
-      </w:pPr>
-      <w:r>
-        <w:rPr>
-          <w:b/>
-          <w:bCs/>
-        </w:rPr>
-        <w:t>Objet du document</w:t>
+          <w:lang w:val="fr-FR"/>
+        </w:rPr>
+      </w:pPr>
+      <w:r>
+        <w:rPr>
+          <w:lang w:val="fr-FR"/>
+        </w:rPr>
+        <w:t>Ce document décrit la procédure de recette qui permettra de valider la conformité de l'application de suivi budgétaire avec le cahier des charges. Il sert de référence pour les tests d'acceptation par le client.</w:t>
       </w:r>
     </w:p>
     <w:p>
-      <w:r>
-        <w:t>Ce document décrit la procédure de recette qui permettra de valider la conformité de l'application de suivi budgétaire avec le cahier des charges. Il sert de référence pour les tests d'acceptation par le client.</w:t>
-      </w:r>
-    </w:p>
-    <w:p>
-      <w:pPr>
-        <w:rPr>
-          <w:b/>
-          <w:bCs/>
-        </w:rPr>
-      </w:pPr>
-      <w:r>
-        <w:rPr>
-          <w:b/>
-          <w:bCs/>
-        </w:rPr>
-        <w:t>Objectifs de la recette</w:t>
-      </w:r>
+      <w:pPr>
+        <w:rPr>
+          <w:b/>
+          <w:bCs/>
+        </w:rPr>
+      </w:pPr>
+      <w:proofErr w:type="spellStart"/>
+      <w:r>
+        <w:rPr>
+          <w:b/>
+          <w:bCs/>
+        </w:rPr>
+        <w:t>Objectifs</w:t>
+      </w:r>
+      <w:proofErr w:type="spellEnd"/>
+      <w:r>
+        <w:rPr>
+          <w:b/>
+          <w:bCs/>
+        </w:rPr>
+        <w:t xml:space="preserve"> de la </w:t>
+      </w:r>
+      <w:proofErr w:type="spellStart"/>
+      <w:r>
+        <w:rPr>
+          <w:b/>
+          <w:bCs/>
+        </w:rPr>
+        <w:t>recette</w:t>
+      </w:r>
+      <w:proofErr w:type="spellEnd"/>
     </w:p>
     <w:p>
       <w:pPr>
@@ -198,8 +215,14 @@
           <w:ilvl w:val="0"/>
           <w:numId w:val="1"/>
         </w:numPr>
-      </w:pPr>
-      <w:r>
+        <w:rPr>
+          <w:lang w:val="fr-FR"/>
+        </w:rPr>
+      </w:pPr>
+      <w:r>
+        <w:rPr>
+          <w:lang w:val="fr-FR"/>
+        </w:rPr>
         <w:t>Vérifier que toutes les fonctionnalités spécifiées sont implémentées</w:t>
       </w:r>
     </w:p>
@@ -209,8 +232,14 @@
           <w:ilvl w:val="0"/>
           <w:numId w:val="1"/>
         </w:numPr>
-      </w:pPr>
-      <w:r>
+        <w:rPr>
+          <w:lang w:val="fr-FR"/>
+        </w:rPr>
+      </w:pPr>
+      <w:r>
+        <w:rPr>
+          <w:lang w:val="fr-FR"/>
+        </w:rPr>
         <w:t>Valider le bon fonctionnement de l'application</w:t>
       </w:r>
     </w:p>
@@ -220,8 +249,14 @@
           <w:ilvl w:val="0"/>
           <w:numId w:val="1"/>
         </w:numPr>
-      </w:pPr>
-      <w:r>
+        <w:rPr>
+          <w:lang w:val="fr-FR"/>
+        </w:rPr>
+      </w:pPr>
+      <w:r>
+        <w:rPr>
+          <w:lang w:val="fr-FR"/>
+        </w:rPr>
         <w:t>S'assurer de la qualité et de la stabilité du produit</w:t>
       </w:r>
     </w:p>
@@ -231,8 +266,14 @@
           <w:ilvl w:val="0"/>
           <w:numId w:val="1"/>
         </w:numPr>
-      </w:pPr>
-      <w:r>
+        <w:rPr>
+          <w:lang w:val="fr-FR"/>
+        </w:rPr>
+      </w:pPr>
+      <w:r>
+        <w:rPr>
+          <w:lang w:val="fr-FR"/>
+        </w:rPr>
         <w:t>Documenter les éventuels écarts et anomalies</w:t>
       </w:r>
     </w:p>
@@ -243,13 +284,31 @@
           <w:bCs/>
         </w:rPr>
       </w:pPr>
-      <w:r>
-        <w:rPr>
-          <w:b/>
-          <w:bCs/>
-        </w:rPr>
-        <w:t>Participants à la recette</w:t>
-      </w:r>
+      <w:proofErr w:type="gramStart"/>
+      <w:r>
+        <w:rPr>
+          <w:b/>
+          <w:bCs/>
+        </w:rPr>
+        <w:t>Participants</w:t>
+      </w:r>
+      <w:proofErr w:type="gramEnd"/>
+      <w:r>
+        <w:rPr>
+          <w:b/>
+          <w:bCs/>
+        </w:rPr>
+        <w:t xml:space="preserve"> à la </w:t>
+      </w:r>
+      <w:proofErr w:type="spellStart"/>
+      <w:r>
+        <w:rPr>
+          <w:b/>
+          <w:bCs/>
+        </w:rPr>
+        <w:t>recette</w:t>
+      </w:r>
+      <w:proofErr w:type="spellEnd"/>
     </w:p>
     <w:p>
       <w:pPr>
@@ -257,16 +316,37 @@
           <w:ilvl w:val="0"/>
           <w:numId w:val="2"/>
         </w:numPr>
-      </w:pPr>
-      <w:r>
-        <w:rPr>
-          <w:b/>
-          <w:bCs/>
+        <w:rPr>
+          <w:lang w:val="fr-FR"/>
+        </w:rPr>
+      </w:pPr>
+      <w:r>
+        <w:rPr>
+          <w:b/>
+          <w:bCs/>
+          <w:lang w:val="fr-FR"/>
         </w:rPr>
         <w:t>Client</w:t>
       </w:r>
       <w:r>
-        <w:t> : Lycée Raombana (utilisateurs finaux)</w:t>
+        <w:rPr>
+          <w:lang w:val="fr-FR"/>
+        </w:rPr>
+        <w:t xml:space="preserve"> : Lycée </w:t>
+      </w:r>
+      <w:proofErr w:type="spellStart"/>
+      <w:r>
+        <w:rPr>
+          <w:lang w:val="fr-FR"/>
+        </w:rPr>
+        <w:t>Raombana</w:t>
+      </w:r>
+      <w:proofErr w:type="spellEnd"/>
+      <w:r>
+        <w:rPr>
+          <w:lang w:val="fr-FR"/>
+        </w:rPr>
+        <w:t xml:space="preserve"> (utilisateurs finaux)</w:t>
       </w:r>
     </w:p>
     <w:p>
@@ -275,15 +355,22 @@
           <w:ilvl w:val="0"/>
           <w:numId w:val="2"/>
         </w:numPr>
-      </w:pPr>
-      <w:r>
-        <w:rPr>
-          <w:b/>
-          <w:bCs/>
+        <w:rPr>
+          <w:lang w:val="fr-FR"/>
+        </w:rPr>
+      </w:pPr>
+      <w:r>
+        <w:rPr>
+          <w:b/>
+          <w:bCs/>
+          <w:lang w:val="fr-FR"/>
         </w:rPr>
         <w:t>Équipe de développement</w:t>
       </w:r>
       <w:r>
+        <w:rPr>
+          <w:lang w:val="fr-FR"/>
+        </w:rPr>
         <w:t> (support technique)</w:t>
       </w:r>
     </w:p>
@@ -299,8 +386,17 @@
           <w:b/>
           <w:bCs/>
         </w:rPr>
-        <w:t>Chef de projet</w:t>
-      </w:r>
+        <w:t xml:space="preserve">Chef de </w:t>
+      </w:r>
+      <w:proofErr w:type="spellStart"/>
+      <w:r>
+        <w:rPr>
+          <w:b/>
+          <w:bCs/>
+        </w:rPr>
+        <w:t>projet</w:t>
+      </w:r>
+      <w:proofErr w:type="spellEnd"/>
       <w:r>
         <w:t> (coordination)</w:t>
       </w:r>
@@ -341,8 +437,14 @@
           <w:ilvl w:val="0"/>
           <w:numId w:val="3"/>
         </w:numPr>
-      </w:pPr>
-      <w:r>
+        <w:rPr>
+          <w:lang w:val="fr-FR"/>
+        </w:rPr>
+      </w:pPr>
+      <w:r>
+        <w:rPr>
+          <w:lang w:val="fr-FR"/>
+        </w:rPr>
         <w:t>Tests manuels basés sur des scénarios utilisateurs</w:t>
       </w:r>
     </w:p>
@@ -354,7 +456,15 @@
         </w:numPr>
       </w:pPr>
       <w:r>
-        <w:t>Validation fonctionnelle point par point</w:t>
+        <w:t xml:space="preserve">Validation </w:t>
+      </w:r>
+      <w:proofErr w:type="spellStart"/>
+      <w:r>
+        <w:t>fonctionnelle</w:t>
+      </w:r>
+      <w:proofErr w:type="spellEnd"/>
+      <w:r>
+        <w:t xml:space="preserve"> point par point</w:t>
       </w:r>
     </w:p>
     <w:p>
@@ -411,8 +521,14 @@
           <w:ilvl w:val="0"/>
           <w:numId w:val="4"/>
         </w:numPr>
-      </w:pPr>
-      <w:r>
+        <w:rPr>
+          <w:lang w:val="fr-FR"/>
+        </w:rPr>
+      </w:pPr>
+      <w:r>
+        <w:rPr>
+          <w:lang w:val="fr-FR"/>
+        </w:rPr>
         <w:t>Jeu de données de test prédéfini</w:t>
       </w:r>
     </w:p>
@@ -424,8 +540,21 @@
         </w:numPr>
       </w:pPr>
       <w:r>
-        <w:t>Capture d'écran pour preuve</w:t>
-      </w:r>
+        <w:t xml:space="preserve">Capture </w:t>
+      </w:r>
+      <w:proofErr w:type="spellStart"/>
+      <w:r>
+        <w:t>d'écran</w:t>
+      </w:r>
+      <w:proofErr w:type="spellEnd"/>
+      <w:r>
+        <w:t xml:space="preserve"> pour </w:t>
+      </w:r>
+      <w:proofErr w:type="spellStart"/>
+      <w:r>
+        <w:t>preuve</w:t>
+      </w:r>
+      <w:proofErr w:type="spellEnd"/>
     </w:p>
     <w:p>
       <w:pPr>
@@ -466,15 +595,22 @@
           <w:ilvl w:val="0"/>
           <w:numId w:val="5"/>
         </w:numPr>
-      </w:pPr>
-      <w:r>
-        <w:rPr>
-          <w:b/>
-          <w:bCs/>
+        <w:rPr>
+          <w:lang w:val="fr-FR"/>
+        </w:rPr>
+      </w:pPr>
+      <w:r>
+        <w:rPr>
+          <w:b/>
+          <w:bCs/>
+          <w:lang w:val="fr-FR"/>
         </w:rPr>
         <w:t>Tolérance</w:t>
       </w:r>
       <w:r>
+        <w:rPr>
+          <w:lang w:val="fr-FR"/>
+        </w:rPr>
         <w:t> : Maximum 3 anomalies mineures non bloquantes</w:t>
       </w:r>
     </w:p>
@@ -484,15 +620,22 @@
           <w:ilvl w:val="0"/>
           <w:numId w:val="5"/>
         </w:numPr>
-      </w:pPr>
-      <w:r>
-        <w:rPr>
-          <w:b/>
-          <w:bCs/>
+        <w:rPr>
+          <w:lang w:val="fr-FR"/>
+        </w:rPr>
+      </w:pPr>
+      <w:r>
+        <w:rPr>
+          <w:b/>
+          <w:bCs/>
+          <w:lang w:val="fr-FR"/>
         </w:rPr>
         <w:t>Rejet</w:t>
       </w:r>
       <w:r>
+        <w:rPr>
+          <w:lang w:val="fr-FR"/>
+        </w:rPr>
         <w:t> : Une anomalie critique ou plus de 5 anomalies mineures</w:t>
       </w:r>
     </w:p>
@@ -503,92 +646,122 @@
           <w:szCs w:val="28"/>
         </w:rPr>
       </w:pPr>
+      <w:proofErr w:type="spellStart"/>
       <w:r>
         <w:rPr>
           <w:sz w:val="28"/>
           <w:szCs w:val="28"/>
         </w:rPr>
         <w:lastRenderedPageBreak/>
-        <w:t>Scénarios de Test</w:t>
+        <w:t>Scénarios</w:t>
+      </w:r>
+      <w:proofErr w:type="spellEnd"/>
+      <w:r>
+        <w:rPr>
+          <w:sz w:val="28"/>
+          <w:szCs w:val="28"/>
+        </w:rPr>
+        <w:t xml:space="preserve"> de Test</w:t>
       </w:r>
     </w:p>
     <w:p>
-      <w:r>
-        <w:t>Scénario 1 : Gestion des Resources (Revenus)</w:t>
+      <w:pPr>
+        <w:rPr>
+          <w:lang w:val="fr-FR"/>
+        </w:rPr>
+      </w:pPr>
+      <w:r>
+        <w:rPr>
+          <w:lang w:val="fr-FR"/>
+        </w:rPr>
+        <w:t xml:space="preserve">Scénario 1 : Gestion des </w:t>
+      </w:r>
+      <w:proofErr w:type="spellStart"/>
+      <w:r>
+        <w:rPr>
+          <w:lang w:val="fr-FR"/>
+        </w:rPr>
+        <w:t>Resources</w:t>
+      </w:r>
+      <w:proofErr w:type="spellEnd"/>
+      <w:r>
+        <w:rPr>
+          <w:lang w:val="fr-FR"/>
+        </w:rPr>
+        <w:t xml:space="preserve"> (Revenus)</w:t>
       </w:r>
     </w:p>
     <w:p>
       <w:pPr>
         <w:rPr>
-          <w:lang w:val="en-US"/>
-        </w:rPr>
-      </w:pPr>
-      <w:r>
-        <w:rPr>
-          <w:b/>
-          <w:bCs/>
+          <w:lang w:val="fr-FR"/>
+        </w:rPr>
+      </w:pPr>
+      <w:r>
+        <w:rPr>
+          <w:b/>
+          <w:bCs/>
+          <w:lang w:val="fr-FR"/>
         </w:rPr>
         <w:t>Objectif</w:t>
       </w:r>
       <w:r>
+        <w:rPr>
+          <w:lang w:val="fr-FR"/>
+        </w:rPr>
         <w:t> : Vérifier l'ajout</w:t>
       </w:r>
       <w:r>
         <w:rPr>
-          <w:lang w:val="en-US"/>
+          <w:lang w:val="fr-FR"/>
         </w:rPr>
         <w:t xml:space="preserve"> et</w:t>
       </w:r>
       <w:r>
+        <w:rPr>
+          <w:lang w:val="fr-FR"/>
+        </w:rPr>
         <w:t xml:space="preserve"> modification des ressources</w:t>
       </w:r>
     </w:p>
     <w:tbl>
       <w:tblPr>
         <w:tblStyle w:val="TableGrid"/>
-        <w:tblW w:w="9990" w:type="dxa"/>
+        <w:tblW w:w="10406" w:type="dxa"/>
         <w:tblInd w:w="-455" w:type="dxa"/>
         <w:tblLook w:val="04A0" w:firstRow="1" w:lastRow="0" w:firstColumn="1" w:lastColumn="0" w:noHBand="0" w:noVBand="1"/>
       </w:tblPr>
       <w:tblGrid>
-        <w:gridCol w:w="2000"/>
-        <w:gridCol w:w="1789"/>
+        <w:gridCol w:w="1455"/>
+        <w:gridCol w:w="1554"/>
         <w:gridCol w:w="2732"/>
-        <w:gridCol w:w="1668"/>
-        <w:gridCol w:w="1801"/>
+        <w:gridCol w:w="1579"/>
+        <w:gridCol w:w="1518"/>
+        <w:gridCol w:w="1568"/>
       </w:tblGrid>
       <w:tr>
         <w:tc>
           <w:tcPr>
-            <w:tcW w:w="2000" w:type="dxa"/>
+            <w:tcW w:w="1455" w:type="dxa"/>
             <w:vAlign w:val="center"/>
           </w:tcPr>
           <w:p>
             <w:pPr>
               <w:jc w:val="center"/>
-              <w:rPr>
-                <w:lang w:val="en-US"/>
-              </w:rPr>
-            </w:pPr>
-            <w:r>
-              <w:rPr>
-                <w:lang w:val="en-US"/>
-              </w:rPr>
+            </w:pPr>
+            <w:r>
               <w:t>Description</w:t>
             </w:r>
           </w:p>
         </w:tc>
         <w:tc>
           <w:tcPr>
-            <w:tcW w:w="1789" w:type="dxa"/>
+            <w:tcW w:w="1554" w:type="dxa"/>
             <w:vAlign w:val="center"/>
           </w:tcPr>
           <w:p>
             <w:pPr>
               <w:jc w:val="center"/>
-              <w:rPr>
-                <w:lang w:val="en-US"/>
-              </w:rPr>
             </w:pPr>
             <w:r>
               <w:t>Préconditions</w:t>
@@ -597,7 +770,7 @@
         </w:tc>
         <w:tc>
           <w:tcPr>
-            <w:tcW w:w="2732" w:type="dxa"/>
+            <w:tcW w:w="2301" w:type="dxa"/>
             <w:vAlign w:val="center"/>
           </w:tcPr>
           <w:p>
@@ -606,9 +779,6 @@
                 <w:tab w:val="center" w:pos="1025"/>
               </w:tabs>
               <w:jc w:val="center"/>
-              <w:rPr>
-                <w:lang w:val="en-US"/>
-              </w:rPr>
             </w:pPr>
             <w:r>
               <w:t>Étapes à exécuter</w:t>
@@ -617,15 +787,12 @@
         </w:tc>
         <w:tc>
           <w:tcPr>
-            <w:tcW w:w="1668" w:type="dxa"/>
+            <w:tcW w:w="2005" w:type="dxa"/>
             <w:vAlign w:val="center"/>
           </w:tcPr>
           <w:p>
             <w:pPr>
               <w:jc w:val="center"/>
-              <w:rPr>
-                <w:lang w:val="en-US"/>
-              </w:rPr>
             </w:pPr>
             <w:r>
               <w:t>Résultat attendu</w:t>
@@ -634,21 +801,47 @@
         </w:tc>
         <w:tc>
           <w:tcPr>
-            <w:tcW w:w="1801" w:type="dxa"/>
+            <w:tcW w:w="1518" w:type="dxa"/>
             <w:vAlign w:val="center"/>
           </w:tcPr>
           <w:p>
             <w:pPr>
               <w:jc w:val="center"/>
-              <w:rPr>
-                <w:lang w:val="en-US"/>
-              </w:rPr>
-            </w:pPr>
-            <w:r>
-              <w:rPr>
-                <w:lang w:val="en-US"/>
-              </w:rPr>
-              <w:t>OK/KO</w:t>
+            </w:pPr>
+            <w:r>
+              <w:t>R</w:t>
+            </w:r>
+            <w:r>
+              <w:rPr>
+                <w:lang w:val="fr-FR"/>
+              </w:rPr>
+              <w:t>é</w:t>
+            </w:r>
+            <w:proofErr w:type="spellStart"/>
+            <w:r>
+              <w:t>sultat</w:t>
+            </w:r>
+            <w:proofErr w:type="spellEnd"/>
+            <w:r>
+              <w:t xml:space="preserve"> </w:t>
+            </w:r>
+            <w:proofErr w:type="spellStart"/>
+            <w:r>
+              <w:t>obtenu</w:t>
+            </w:r>
+            <w:proofErr w:type="spellEnd"/>
+          </w:p>
+        </w:tc>
+        <w:tc>
+          <w:tcPr>
+            <w:tcW w:w="1573" w:type="dxa"/>
+          </w:tcPr>
+          <w:p>
+            <w:pPr>
+              <w:jc w:val="center"/>
+            </w:pPr>
+            <w:r>
+              <w:t>Suggestion</w:t>
             </w:r>
           </w:p>
         </w:tc>
@@ -659,73 +852,46 @@
         </w:trPr>
         <w:tc>
           <w:tcPr>
-            <w:tcW w:w="2000" w:type="dxa"/>
+            <w:tcW w:w="1455" w:type="dxa"/>
             <w:vAlign w:val="center"/>
           </w:tcPr>
           <w:p>
             <w:pPr>
               <w:jc w:val="center"/>
-              <w:rPr>
-                <w:lang w:val="en-US"/>
-              </w:rPr>
             </w:pPr>
             <w:proofErr w:type="spellStart"/>
             <w:r>
-              <w:rPr>
-                <w:lang w:val="en-US"/>
-              </w:rPr>
               <w:t>Ajout</w:t>
             </w:r>
             <w:proofErr w:type="spellEnd"/>
             <w:r>
-              <w:rPr>
-                <w:lang w:val="en-US"/>
-              </w:rPr>
-              <w:t xml:space="preserve"> de re</w:t>
-            </w:r>
-            <w:r>
-              <w:rPr>
-                <w:lang w:val="en-US"/>
-              </w:rPr>
-              <w:t>s</w:t>
-            </w:r>
-            <w:r>
-              <w:rPr>
-                <w:lang w:val="en-US"/>
-              </w:rPr>
-              <w:t>ource</w:t>
-            </w:r>
-          </w:p>
-        </w:tc>
-        <w:tc>
-          <w:tcPr>
-            <w:tcW w:w="1789" w:type="dxa"/>
+              <w:t xml:space="preserve"> de resource</w:t>
+            </w:r>
+          </w:p>
+        </w:tc>
+        <w:tc>
+          <w:tcPr>
+            <w:tcW w:w="1554" w:type="dxa"/>
             <w:vAlign w:val="center"/>
           </w:tcPr>
           <w:p>
             <w:pPr>
               <w:jc w:val="center"/>
               <w:rPr>
-                <w:lang w:val="en-US"/>
-              </w:rPr>
-            </w:pPr>
-            <w:r>
-              <w:rPr>
-                <w:lang w:val="en-US"/>
-              </w:rPr>
-              <w:t xml:space="preserve">Application ouverte page </w:t>
-            </w:r>
-            <w:r>
-              <w:rPr>
-                <w:lang w:val="en-US"/>
-              </w:rPr>
-              <w:t>de transaction</w:t>
-            </w:r>
-          </w:p>
-        </w:tc>
-        <w:tc>
-          <w:tcPr>
-            <w:tcW w:w="2732" w:type="dxa"/>
+                <w:lang w:val="fr-FR"/>
+              </w:rPr>
+            </w:pPr>
+            <w:r>
+              <w:rPr>
+                <w:lang w:val="fr-FR"/>
+              </w:rPr>
+              <w:t>Application ouverte page de transaction</w:t>
+            </w:r>
+          </w:p>
+        </w:tc>
+        <w:tc>
+          <w:tcPr>
+            <w:tcW w:w="2301" w:type="dxa"/>
             <w:vAlign w:val="center"/>
           </w:tcPr>
           <w:p>
@@ -740,10 +906,15 @@
               </w:tabs>
             </w:pPr>
             <w:r>
-              <w:rPr>
-                <w:lang w:val="en-US"/>
-              </w:rPr>
-              <w:t>Cliquer “bouton plus”</w:t>
+              <w:t>Cliquer “</w:t>
+            </w:r>
+            <w:proofErr w:type="spellStart"/>
+            <w:r>
+              <w:t>bouton</w:t>
+            </w:r>
+            <w:proofErr w:type="spellEnd"/>
+            <w:r>
+              <w:t xml:space="preserve"> plus”</w:t>
             </w:r>
           </w:p>
           <w:p>
@@ -756,45 +927,15 @@
               <w:tabs>
                 <w:tab w:val="center" w:pos="1025"/>
               </w:tabs>
-            </w:pPr>
-            <w:r>
-              <w:t>Remplir</w:t>
-            </w:r>
-            <w:r>
-              <w:rPr>
-                <w:lang w:val="en-US"/>
-              </w:rPr>
-              <w:t xml:space="preserve"> </w:t>
-            </w:r>
-            <w:r>
-              <w:t>Montant=1500, Date=</w:t>
-            </w:r>
-            <w:r>
-              <w:rPr>
-                <w:lang w:val="en-US"/>
-              </w:rPr>
-              <w:t>1</w:t>
-            </w:r>
-            <w:r>
-              <w:t>1/</w:t>
-            </w:r>
-            <w:r>
-              <w:rPr>
-                <w:lang w:val="en-US"/>
-              </w:rPr>
-              <w:t>10</w:t>
-            </w:r>
-            <w:r>
-              <w:t>/2024, Source="</w:t>
-            </w:r>
-            <w:r>
-              <w:rPr>
-                <w:lang w:val="en-US"/>
-              </w:rPr>
-              <w:t>VOI</w:t>
-            </w:r>
-            <w:r>
-              <w:t>"</w:t>
+              <w:rPr>
+                <w:lang w:val="fr-FR"/>
+              </w:rPr>
+            </w:pPr>
+            <w:r>
+              <w:rPr>
+                <w:lang w:val="fr-FR"/>
+              </w:rPr>
+              <w:t>Remplir Montant=1500, Date=11/10/2024, Source="VOI"</w:t>
             </w:r>
           </w:p>
           <w:p>
@@ -809,16 +950,18 @@
               </w:tabs>
             </w:pPr>
             <w:r>
-              <w:rPr>
-                <w:lang w:val="en-US"/>
-              </w:rPr>
-              <w:t xml:space="preserve">Clique bouton </w:t>
+              <w:t xml:space="preserve">Clique </w:t>
             </w:r>
             <w:proofErr w:type="spellStart"/>
             <w:r>
-              <w:rPr>
-                <w:lang w:val="en-US"/>
-              </w:rPr>
+              <w:t>bouton</w:t>
+            </w:r>
+            <w:proofErr w:type="spellEnd"/>
+            <w:r>
+              <w:t xml:space="preserve"> </w:t>
+            </w:r>
+            <w:proofErr w:type="spellStart"/>
+            <w:r>
               <w:t>enregistrer</w:t>
             </w:r>
             <w:proofErr w:type="spellEnd"/>
@@ -826,111 +969,109 @@
         </w:tc>
         <w:tc>
           <w:tcPr>
-            <w:tcW w:w="1668" w:type="dxa"/>
+            <w:tcW w:w="2005" w:type="dxa"/>
             <w:vAlign w:val="center"/>
           </w:tcPr>
           <w:p>
             <w:pPr>
               <w:jc w:val="center"/>
               <w:rPr>
-                <w:lang w:val="en-US"/>
-              </w:rPr>
-            </w:pPr>
-            <w:r>
-              <w:t xml:space="preserve">La ressource apparaît dans la liste </w:t>
-            </w:r>
-            <w:r>
-              <w:rPr>
-                <w:lang w:val="en-US"/>
-              </w:rPr>
-              <w:t>des</w:t>
-            </w:r>
-            <w:r>
-              <w:t xml:space="preserve"> montant</w:t>
-            </w:r>
-            <w:r>
-              <w:rPr>
-                <w:lang w:val="en-US"/>
-              </w:rPr>
-              <w:t>s</w:t>
-            </w:r>
-          </w:p>
-        </w:tc>
-        <w:tc>
-          <w:tcPr>
-            <w:tcW w:w="1801" w:type="dxa"/>
-            <w:vAlign w:val="center"/>
-          </w:tcPr>
-          <w:p>
-            <w:pPr>
-              <w:pStyle w:val="ListParagraph"/>
-              <w:numPr>
-                <w:ilvl w:val="0"/>
-                <w:numId w:val="7"/>
-              </w:numPr>
-            </w:pPr>
-            <w:r>
-              <w:t>OK : le montant des</w:t>
-            </w:r>
-            <w:r>
-              <w:rPr>
-                <w:lang w:val="en-US"/>
-              </w:rPr>
-              <w:t xml:space="preserve"> </w:t>
+                <w:lang w:val="fr-FR"/>
+              </w:rPr>
+            </w:pPr>
+            <w:r>
+              <w:rPr>
+                <w:lang w:val="fr-FR"/>
+              </w:rPr>
+              <w:t>La ressource apparaît dans la liste des montants</w:t>
+            </w:r>
+          </w:p>
+        </w:tc>
+        <w:tc>
+          <w:tcPr>
+            <w:tcW w:w="1518" w:type="dxa"/>
+            <w:vAlign w:val="center"/>
+          </w:tcPr>
+          <w:p>
+            <w:pPr>
+              <w:ind w:left="360"/>
+              <w:rPr>
+                <w:lang w:val="fr-FR"/>
+              </w:rPr>
+            </w:pPr>
+            <w:r>
+              <w:rPr>
+                <w:b/>
+                <w:lang w:val="fr-FR"/>
+              </w:rPr>
+              <w:t>OK</w:t>
+            </w:r>
+            <w:r>
+              <w:rPr>
+                <w:lang w:val="fr-FR"/>
+              </w:rPr>
+              <w:t xml:space="preserve"> : le montant des soldes initial a bien été à jour</w:t>
+            </w:r>
+          </w:p>
+          <w:p>
+            <w:pPr>
+              <w:ind w:left="360"/>
+              <w:rPr>
+                <w:lang w:val="fr-FR"/>
+              </w:rPr>
+            </w:pPr>
+            <w:r>
+              <w:rPr>
+                <w:b/>
+                <w:lang w:val="fr-FR"/>
+              </w:rPr>
+              <w:t>KO</w:t>
+            </w:r>
+            <w:r>
+              <w:rPr>
+                <w:lang w:val="fr-FR"/>
+              </w:rPr>
+              <w:t xml:space="preserve"> : le montant négatif est accepter</w:t>
+            </w:r>
+          </w:p>
+        </w:tc>
+        <w:tc>
+          <w:tcPr>
+            <w:tcW w:w="1573" w:type="dxa"/>
+            <w:vAlign w:val="center"/>
+          </w:tcPr>
+          <w:p>
+            <w:pPr>
+              <w:ind w:left="360"/>
+              <w:rPr>
+                <w:lang w:val="fr-FR"/>
+              </w:rPr>
+            </w:pPr>
+            <w:r>
+              <w:rPr>
+                <w:lang w:val="fr-FR"/>
+              </w:rPr>
+              <w:t>Ajouter un contrôle champs</w:t>
+            </w:r>
+            <w:r>
+              <w:rPr>
+                <w:lang w:val="fr-FR"/>
+              </w:rPr>
+              <w:t xml:space="preserve"> pour empêcher de </w:t>
             </w:r>
             <w:proofErr w:type="spellStart"/>
             <w:r>
               <w:rPr>
-                <w:lang w:val="en-US"/>
-              </w:rPr>
-              <w:t>soldes</w:t>
+                <w:lang w:val="fr-FR"/>
+              </w:rPr>
+              <w:t>reçevoir</w:t>
             </w:r>
             <w:proofErr w:type="spellEnd"/>
             <w:r>
               <w:rPr>
-                <w:lang w:val="en-US"/>
-              </w:rPr>
-              <w:t xml:space="preserve"> initial a bien </w:t>
-            </w:r>
-            <w:proofErr w:type="spellStart"/>
-            <w:r>
-              <w:rPr>
-                <w:lang w:val="en-US"/>
-              </w:rPr>
-              <w:t>été</w:t>
-            </w:r>
-            <w:proofErr w:type="spellEnd"/>
-            <w:r>
-              <w:rPr>
-                <w:lang w:val="en-US"/>
-              </w:rPr>
-              <w:t xml:space="preserve"> à jour</w:t>
-            </w:r>
-          </w:p>
-          <w:p>
-            <w:pPr>
-              <w:pStyle w:val="ListParagraph"/>
-              <w:numPr>
-                <w:ilvl w:val="0"/>
-                <w:numId w:val="7"/>
-              </w:numPr>
-            </w:pPr>
-            <w:r>
-              <w:t xml:space="preserve">KO : le montant </w:t>
-            </w:r>
-            <w:proofErr w:type="spellStart"/>
-            <w:r>
-              <w:rPr>
-                <w:lang w:val="en-US"/>
-              </w:rPr>
-              <w:t>négatif</w:t>
-            </w:r>
-            <w:proofErr w:type="spellEnd"/>
-            <w:r>
-              <w:rPr>
-                <w:lang w:val="en-US"/>
-              </w:rPr>
-              <w:t xml:space="preserve"> est accepter</w:t>
+                <w:lang w:val="fr-FR"/>
+              </w:rPr>
+              <w:t xml:space="preserve"> donnée incorrect sur le champs</w:t>
             </w:r>
           </w:p>
         </w:tc>
@@ -941,59 +1082,32 @@
         </w:trPr>
         <w:tc>
           <w:tcPr>
-            <w:tcW w:w="2000" w:type="dxa"/>
+            <w:tcW w:w="1455" w:type="dxa"/>
             <w:vAlign w:val="center"/>
           </w:tcPr>
           <w:p>
             <w:pPr>
               <w:jc w:val="center"/>
-              <w:rPr>
-                <w:lang w:val="en-US"/>
-              </w:rPr>
-            </w:pPr>
-            <w:r>
-              <w:rPr>
-                <w:lang w:val="en-US"/>
-              </w:rPr>
-              <w:t>Modification de re</w:t>
-            </w:r>
-            <w:r>
-              <w:rPr>
-                <w:lang w:val="en-US"/>
-              </w:rPr>
-              <w:t>s</w:t>
-            </w:r>
-            <w:r>
-              <w:rPr>
-                <w:lang w:val="en-US"/>
-              </w:rPr>
-              <w:t>ource</w:t>
-            </w:r>
-          </w:p>
-        </w:tc>
-        <w:tc>
-          <w:tcPr>
-            <w:tcW w:w="1789" w:type="dxa"/>
+            </w:pPr>
+            <w:r>
+              <w:t>Modification de resource</w:t>
+            </w:r>
+          </w:p>
+        </w:tc>
+        <w:tc>
+          <w:tcPr>
+            <w:tcW w:w="1554" w:type="dxa"/>
             <w:vAlign w:val="center"/>
           </w:tcPr>
           <w:p>
             <w:pPr>
               <w:jc w:val="center"/>
-              <w:rPr>
-                <w:lang w:val="en-US"/>
-              </w:rPr>
-            </w:pPr>
-            <w:r>
-              <w:rPr>
-                <w:lang w:val="en-US"/>
-              </w:rPr>
+            </w:pPr>
+            <w:r>
               <w:t xml:space="preserve">Resource déjà </w:t>
             </w:r>
             <w:proofErr w:type="spellStart"/>
             <w:r>
-              <w:rPr>
-                <w:lang w:val="en-US"/>
-              </w:rPr>
               <w:t>défini</w:t>
             </w:r>
             <w:proofErr w:type="spellEnd"/>
@@ -1001,7 +1115,7 @@
         </w:tc>
         <w:tc>
           <w:tcPr>
-            <w:tcW w:w="2732" w:type="dxa"/>
+            <w:tcW w:w="2301" w:type="dxa"/>
             <w:vAlign w:val="center"/>
           </w:tcPr>
           <w:p>
@@ -1015,62 +1129,30 @@
                 <w:tab w:val="center" w:pos="1025"/>
               </w:tabs>
               <w:rPr>
-                <w:lang w:val="en-US"/>
-              </w:rPr>
-            </w:pPr>
-            <w:r>
-              <w:rPr>
-                <w:lang w:val="en-US"/>
-              </w:rPr>
-              <w:t xml:space="preserve">Cliquer sur la cellule qui </w:t>
+                <w:lang w:val="fr-FR"/>
+              </w:rPr>
+            </w:pPr>
+            <w:r>
+              <w:rPr>
+                <w:lang w:val="fr-FR"/>
+              </w:rPr>
+              <w:t xml:space="preserve">Cliquer sur la cellule qui contient la montant </w:t>
             </w:r>
             <w:proofErr w:type="spellStart"/>
-            <w:r>
-              <w:rPr>
-                <w:lang w:val="en-US"/>
-              </w:rPr>
-              <w:t>contient</w:t>
+            <w:proofErr w:type="gramStart"/>
+            <w:r>
+              <w:rPr>
+                <w:lang w:val="fr-FR"/>
+              </w:rPr>
+              <w:t>a</w:t>
             </w:r>
             <w:proofErr w:type="spellEnd"/>
-            <w:r>
-              <w:rPr>
-                <w:lang w:val="en-US"/>
-              </w:rPr>
-              <w:t xml:space="preserve"> la </w:t>
-            </w:r>
-            <w:proofErr w:type="spellStart"/>
-            <w:r>
-              <w:rPr>
-                <w:lang w:val="en-US"/>
-              </w:rPr>
-              <w:t>montant</w:t>
-            </w:r>
-            <w:proofErr w:type="spellEnd"/>
-            <w:r>
-              <w:rPr>
-                <w:lang w:val="en-US"/>
-              </w:rPr>
-              <w:t xml:space="preserve"> a changer</w:t>
-            </w:r>
-            <w:r>
-              <w:rPr>
-                <w:lang w:val="en-US"/>
-              </w:rPr>
-              <w:t xml:space="preserve"> </w:t>
-            </w:r>
-            <w:proofErr w:type="spellStart"/>
-            <w:r>
-              <w:rPr>
-                <w:lang w:val="en-US"/>
-              </w:rPr>
-              <w:t>puis</w:t>
-            </w:r>
-            <w:proofErr w:type="spellEnd"/>
-            <w:r>
-              <w:rPr>
-                <w:lang w:val="en-US"/>
-              </w:rPr>
-              <w:t xml:space="preserve"> on entre 400</w:t>
+            <w:proofErr w:type="gramEnd"/>
+            <w:r>
+              <w:rPr>
+                <w:lang w:val="fr-FR"/>
+              </w:rPr>
+              <w:t xml:space="preserve"> changer puis on entre 400</w:t>
             </w:r>
           </w:p>
           <w:p>
@@ -1083,21 +1165,20 @@
               <w:tabs>
                 <w:tab w:val="center" w:pos="1025"/>
               </w:tabs>
-              <w:rPr>
-                <w:lang w:val="en-US"/>
-              </w:rPr>
-            </w:pPr>
-            <w:r>
-              <w:rPr>
-                <w:lang w:val="en-US"/>
-              </w:rPr>
-              <w:t xml:space="preserve">Clique bouton </w:t>
+            </w:pPr>
+            <w:r>
+              <w:t xml:space="preserve">Clique </w:t>
             </w:r>
             <w:proofErr w:type="spellStart"/>
             <w:r>
-              <w:rPr>
-                <w:lang w:val="en-US"/>
-              </w:rPr>
+              <w:t>bouton</w:t>
+            </w:r>
+            <w:proofErr w:type="spellEnd"/>
+            <w:r>
+              <w:t xml:space="preserve"> </w:t>
+            </w:r>
+            <w:proofErr w:type="spellStart"/>
+            <w:r>
               <w:t>enregistrer</w:t>
             </w:r>
             <w:proofErr w:type="spellEnd"/>
@@ -1105,206 +1186,103 @@
         </w:tc>
         <w:tc>
           <w:tcPr>
-            <w:tcW w:w="1668" w:type="dxa"/>
+            <w:tcW w:w="2005" w:type="dxa"/>
             <w:vAlign w:val="center"/>
           </w:tcPr>
           <w:p>
             <w:pPr>
               <w:jc w:val="center"/>
               <w:rPr>
-                <w:lang w:val="en-US"/>
-              </w:rPr>
-            </w:pPr>
-            <w:r>
-              <w:rPr>
-                <w:lang w:val="en-US"/>
-              </w:rPr>
-              <w:t xml:space="preserve">Dans la </w:t>
+                <w:lang w:val="fr-FR"/>
+              </w:rPr>
+            </w:pPr>
+            <w:r>
+              <w:rPr>
+                <w:lang w:val="fr-FR"/>
+              </w:rPr>
+              <w:t>Dans la liste des montants la ressource se met à jour</w:t>
+            </w:r>
+          </w:p>
+        </w:tc>
+        <w:tc>
+          <w:tcPr>
+            <w:tcW w:w="1518" w:type="dxa"/>
+          </w:tcPr>
+          <w:p>
+            <w:pPr>
+              <w:ind w:left="360"/>
+              <w:rPr>
+                <w:lang w:val="fr-FR"/>
+              </w:rPr>
+            </w:pPr>
+            <w:r>
+              <w:rPr>
+                <w:b/>
+                <w:lang w:val="fr-FR"/>
+              </w:rPr>
+              <w:t>OK</w:t>
+            </w:r>
+            <w:r>
+              <w:rPr>
+                <w:lang w:val="fr-FR"/>
+              </w:rPr>
+              <w:t>: le montant des soldes initial a été bien mise à jour</w:t>
+            </w:r>
+          </w:p>
+          <w:p>
+            <w:pPr>
+              <w:ind w:left="360"/>
+              <w:rPr>
+                <w:lang w:val="fr-FR"/>
+              </w:rPr>
+            </w:pPr>
+            <w:r>
+              <w:rPr>
+                <w:b/>
+                <w:lang w:val="fr-FR"/>
+              </w:rPr>
+              <w:t>KO</w:t>
+            </w:r>
+            <w:r>
+              <w:rPr>
+                <w:lang w:val="fr-FR"/>
+              </w:rPr>
+              <w:t xml:space="preserve">: le champs ressource montant accepte les nombres négatifs </w:t>
+            </w:r>
+          </w:p>
+        </w:tc>
+        <w:tc>
+          <w:tcPr>
+            <w:tcW w:w="1573" w:type="dxa"/>
+            <w:vAlign w:val="center"/>
+          </w:tcPr>
+          <w:p>
+            <w:pPr>
+              <w:ind w:left="360"/>
+              <w:rPr>
+                <w:b/>
+                <w:lang w:val="fr-FR"/>
+              </w:rPr>
+            </w:pPr>
+            <w:r>
+              <w:rPr>
+                <w:lang w:val="fr-FR"/>
+              </w:rPr>
+              <w:t xml:space="preserve">Ajouter un contrôle champs pour empêcher de </w:t>
             </w:r>
             <w:proofErr w:type="spellStart"/>
             <w:r>
               <w:rPr>
-                <w:lang w:val="en-US"/>
-              </w:rPr>
-              <w:t>liste</w:t>
+                <w:lang w:val="fr-FR"/>
+              </w:rPr>
+              <w:t>reçevoir</w:t>
             </w:r>
             <w:proofErr w:type="spellEnd"/>
             <w:r>
               <w:rPr>
-                <w:lang w:val="en-US"/>
-              </w:rPr>
-              <w:t xml:space="preserve"> des </w:t>
-            </w:r>
-            <w:proofErr w:type="spellStart"/>
-            <w:r>
-              <w:rPr>
-                <w:lang w:val="en-US"/>
-              </w:rPr>
-              <w:t>montants</w:t>
-            </w:r>
-            <w:proofErr w:type="spellEnd"/>
-            <w:r>
-              <w:rPr>
-                <w:lang w:val="en-US"/>
-              </w:rPr>
-              <w:t xml:space="preserve"> la resource se met à jour</w:t>
-            </w:r>
-          </w:p>
-        </w:tc>
-        <w:tc>
-          <w:tcPr>
-            <w:tcW w:w="1801" w:type="dxa"/>
-          </w:tcPr>
-          <w:p>
-            <w:pPr>
-              <w:pStyle w:val="ListParagraph"/>
-              <w:numPr>
-                <w:ilvl w:val="0"/>
-                <w:numId w:val="7"/>
-              </w:numPr>
-            </w:pPr>
-            <w:r>
-              <w:rPr>
-                <w:lang w:val="en-US"/>
-              </w:rPr>
-              <w:t>OK:</w:t>
-            </w:r>
-            <w:r>
-              <w:rPr>
-                <w:lang w:val="en-US"/>
-              </w:rPr>
-              <w:t xml:space="preserve"> le </w:t>
-            </w:r>
-            <w:proofErr w:type="spellStart"/>
-            <w:r>
-              <w:rPr>
-                <w:lang w:val="en-US"/>
-              </w:rPr>
-              <w:t>montant</w:t>
-            </w:r>
-            <w:proofErr w:type="spellEnd"/>
-            <w:r>
-              <w:rPr>
-                <w:lang w:val="en-US"/>
-              </w:rPr>
-              <w:t xml:space="preserve"> des </w:t>
-            </w:r>
-            <w:proofErr w:type="spellStart"/>
-            <w:r>
-              <w:rPr>
-                <w:lang w:val="en-US"/>
-              </w:rPr>
-              <w:t>soldes</w:t>
-            </w:r>
-            <w:proofErr w:type="spellEnd"/>
-            <w:r>
-              <w:rPr>
-                <w:lang w:val="en-US"/>
-              </w:rPr>
-              <w:t xml:space="preserve"> </w:t>
-            </w:r>
-            <w:r>
-              <w:rPr>
-                <w:lang w:val="en-US"/>
-              </w:rPr>
-              <w:t>initial a</w:t>
-            </w:r>
-            <w:r>
-              <w:rPr>
-                <w:lang w:val="en-US"/>
-              </w:rPr>
-              <w:t xml:space="preserve"> </w:t>
-            </w:r>
-            <w:proofErr w:type="spellStart"/>
-            <w:r>
-              <w:rPr>
-                <w:lang w:val="en-US"/>
-              </w:rPr>
-              <w:t>été</w:t>
-            </w:r>
-            <w:proofErr w:type="spellEnd"/>
-            <w:r>
-              <w:rPr>
-                <w:lang w:val="en-US"/>
-              </w:rPr>
-              <w:t xml:space="preserve"> bien mise à jour</w:t>
-            </w:r>
-          </w:p>
-          <w:p>
-            <w:pPr>
-              <w:pStyle w:val="ListParagraph"/>
-              <w:numPr>
-                <w:ilvl w:val="0"/>
-                <w:numId w:val="7"/>
-              </w:numPr>
-            </w:pPr>
-            <w:r>
-              <w:rPr>
-                <w:lang w:val="en-US"/>
-              </w:rPr>
-              <w:t>KO: le champs resource</w:t>
-            </w:r>
-            <w:r>
-              <w:rPr>
-                <w:lang w:val="en-US"/>
-              </w:rPr>
-              <w:t xml:space="preserve"> </w:t>
-            </w:r>
-            <w:proofErr w:type="spellStart"/>
-            <w:r>
-              <w:rPr>
-                <w:lang w:val="en-US"/>
-              </w:rPr>
-              <w:t>montant</w:t>
-            </w:r>
-            <w:proofErr w:type="spellEnd"/>
-            <w:r>
-              <w:rPr>
-                <w:lang w:val="en-US"/>
-              </w:rPr>
-              <w:t xml:space="preserve"> </w:t>
-            </w:r>
-            <w:proofErr w:type="spellStart"/>
-            <w:r>
-              <w:rPr>
-                <w:lang w:val="en-US"/>
-              </w:rPr>
-              <w:t>accepte</w:t>
-            </w:r>
-            <w:proofErr w:type="spellEnd"/>
-            <w:r>
-              <w:rPr>
-                <w:lang w:val="en-US"/>
-              </w:rPr>
-              <w:t xml:space="preserve"> les </w:t>
-            </w:r>
-            <w:proofErr w:type="spellStart"/>
-            <w:r>
-              <w:rPr>
-                <w:lang w:val="en-US"/>
-              </w:rPr>
-              <w:t>nombres</w:t>
-            </w:r>
-            <w:proofErr w:type="spellEnd"/>
-            <w:r>
-              <w:rPr>
-                <w:lang w:val="en-US"/>
-              </w:rPr>
-              <w:t xml:space="preserve"> </w:t>
-            </w:r>
-            <w:proofErr w:type="spellStart"/>
-            <w:r>
-              <w:rPr>
-                <w:lang w:val="en-US"/>
-              </w:rPr>
-              <w:t>négatifs</w:t>
-            </w:r>
-            <w:proofErr w:type="spellEnd"/>
-            <w:r>
-              <w:rPr>
-                <w:lang w:val="en-US"/>
-              </w:rPr>
-              <w:t xml:space="preserve"> </w:t>
+                <w:lang w:val="fr-FR"/>
+              </w:rPr>
+              <w:t xml:space="preserve"> donnée incorrect sur le champs</w:t>
             </w:r>
           </w:p>
         </w:tc>
@@ -1313,135 +1291,98 @@
     <w:p>
       <w:pPr>
         <w:rPr>
-          <w:lang w:val="en-US"/>
+          <w:lang w:val="fr-FR"/>
         </w:rPr>
       </w:pPr>
     </w:p>
     <w:p>
       <w:pPr>
         <w:rPr>
-          <w:lang w:val="en-US"/>
+          <w:lang w:val="fr-FR"/>
         </w:rPr>
       </w:pPr>
     </w:p>
     <w:p>
       <w:pPr>
         <w:rPr>
-          <w:lang w:val="en-US"/>
+          <w:lang w:val="fr-FR"/>
         </w:rPr>
       </w:pPr>
     </w:p>
     <w:p>
       <w:pPr>
         <w:rPr>
-          <w:lang w:val="en-US"/>
+          <w:lang w:val="fr-FR"/>
         </w:rPr>
       </w:pPr>
     </w:p>
     <w:p>
       <w:pPr>
         <w:rPr>
-          <w:lang w:val="en-US"/>
+          <w:lang w:val="fr-FR"/>
         </w:rPr>
       </w:pPr>
     </w:p>
     <w:p>
       <w:pPr>
         <w:rPr>
-          <w:lang w:val="en-US"/>
-        </w:rPr>
-      </w:pPr>
-      <w:proofErr w:type="spellStart"/>
-      <w:r>
-        <w:rPr>
-          <w:lang w:val="en-US"/>
-        </w:rPr>
-        <w:t>Scénario</w:t>
-      </w:r>
-      <w:proofErr w:type="spellEnd"/>
-      <w:r>
-        <w:rPr>
-          <w:lang w:val="en-US"/>
-        </w:rPr>
-        <w:t xml:space="preserve"> </w:t>
-      </w:r>
-      <w:proofErr w:type="gramStart"/>
-      <w:r>
-        <w:rPr>
-          <w:lang w:val="en-US"/>
-        </w:rPr>
-        <w:t>2 :</w:t>
-      </w:r>
-      <w:proofErr w:type="gramEnd"/>
-      <w:r>
-        <w:rPr>
-          <w:lang w:val="en-US"/>
-        </w:rPr>
-        <w:t xml:space="preserve"> Gestion des </w:t>
-      </w:r>
-      <w:proofErr w:type="spellStart"/>
-      <w:r>
-        <w:rPr>
-          <w:lang w:val="en-US"/>
-        </w:rPr>
-        <w:t>dépenses</w:t>
-      </w:r>
-      <w:proofErr w:type="spellEnd"/>
-      <w:r>
-        <w:rPr>
-          <w:lang w:val="en-US"/>
-        </w:rPr>
-        <w:t xml:space="preserve"> </w:t>
+          <w:lang w:val="fr-FR"/>
+        </w:rPr>
+      </w:pPr>
+      <w:r>
+        <w:rPr>
+          <w:lang w:val="fr-FR"/>
+        </w:rPr>
+        <w:t xml:space="preserve">Scénario 2 : Gestion des dépenses </w:t>
       </w:r>
     </w:p>
     <w:p>
       <w:pPr>
         <w:rPr>
-          <w:lang w:val="en-US"/>
-        </w:rPr>
-      </w:pPr>
-      <w:r>
-        <w:rPr>
-          <w:b/>
-          <w:bCs/>
+          <w:lang w:val="fr-FR"/>
+        </w:rPr>
+      </w:pPr>
+      <w:r>
+        <w:rPr>
+          <w:b/>
+          <w:bCs/>
+          <w:lang w:val="fr-FR"/>
         </w:rPr>
         <w:t>Objectif</w:t>
       </w:r>
       <w:r>
+        <w:rPr>
+          <w:lang w:val="fr-FR"/>
+        </w:rPr>
         <w:t> : Tester la gestion complète des dépenses</w:t>
       </w:r>
     </w:p>
     <w:tbl>
       <w:tblPr>
         <w:tblStyle w:val="TableGrid"/>
-        <w:tblW w:w="10080" w:type="dxa"/>
+        <w:tblW w:w="10170" w:type="dxa"/>
         <w:tblInd w:w="-545" w:type="dxa"/>
         <w:tblLook w:val="04A0" w:firstRow="1" w:lastRow="0" w:firstColumn="1" w:lastColumn="0" w:noHBand="0" w:noVBand="1"/>
       </w:tblPr>
       <w:tblGrid>
-        <w:gridCol w:w="2079"/>
-        <w:gridCol w:w="1742"/>
-        <w:gridCol w:w="2477"/>
-        <w:gridCol w:w="1633"/>
-        <w:gridCol w:w="2149"/>
+        <w:gridCol w:w="1455"/>
+        <w:gridCol w:w="1577"/>
+        <w:gridCol w:w="2833"/>
+        <w:gridCol w:w="1325"/>
+        <w:gridCol w:w="1416"/>
+        <w:gridCol w:w="1564"/>
       </w:tblGrid>
       <w:tr>
         <w:tc>
           <w:tcPr>
-            <w:tcW w:w="2079" w:type="dxa"/>
+            <w:tcW w:w="1455" w:type="dxa"/>
             <w:vAlign w:val="center"/>
           </w:tcPr>
           <w:p>
             <w:pPr>
               <w:jc w:val="center"/>
-              <w:rPr>
-                <w:lang w:val="en-US"/>
-              </w:rPr>
-            </w:pPr>
-            <w:r>
-              <w:rPr>
-                <w:lang w:val="en-US"/>
-              </w:rPr>
+            </w:pPr>
+            <w:r>
               <w:lastRenderedPageBreak/>
               <w:t>Description</w:t>
             </w:r>
@@ -1449,15 +1390,12 @@
         </w:tc>
         <w:tc>
           <w:tcPr>
-            <w:tcW w:w="1742" w:type="dxa"/>
+            <w:tcW w:w="1582" w:type="dxa"/>
             <w:vAlign w:val="center"/>
           </w:tcPr>
           <w:p>
             <w:pPr>
               <w:jc w:val="center"/>
-              <w:rPr>
-                <w:lang w:val="en-US"/>
-              </w:rPr>
             </w:pPr>
             <w:r>
               <w:t>Préconditions</w:t>
@@ -1466,15 +1404,12 @@
         </w:tc>
         <w:tc>
           <w:tcPr>
-            <w:tcW w:w="2477" w:type="dxa"/>
+            <w:tcW w:w="2909" w:type="dxa"/>
             <w:vAlign w:val="center"/>
           </w:tcPr>
           <w:p>
             <w:pPr>
               <w:jc w:val="center"/>
-              <w:rPr>
-                <w:lang w:val="en-US"/>
-              </w:rPr>
             </w:pPr>
             <w:r>
               <w:t>Étapes à exécuter</w:t>
@@ -1483,15 +1418,12 @@
         </w:tc>
         <w:tc>
           <w:tcPr>
-            <w:tcW w:w="1633" w:type="dxa"/>
+            <w:tcW w:w="1362" w:type="dxa"/>
             <w:vAlign w:val="center"/>
           </w:tcPr>
           <w:p>
             <w:pPr>
               <w:jc w:val="center"/>
-              <w:rPr>
-                <w:lang w:val="en-US"/>
-              </w:rPr>
             </w:pPr>
             <w:r>
               <w:t>Résultat attendu</w:t>
@@ -1500,21 +1432,45 @@
         </w:tc>
         <w:tc>
           <w:tcPr>
-            <w:tcW w:w="2149" w:type="dxa"/>
+            <w:tcW w:w="1416" w:type="dxa"/>
             <w:vAlign w:val="center"/>
           </w:tcPr>
           <w:p>
             <w:pPr>
               <w:jc w:val="center"/>
-              <w:rPr>
-                <w:lang w:val="en-US"/>
-              </w:rPr>
-            </w:pPr>
-            <w:r>
-              <w:rPr>
-                <w:lang w:val="en-US"/>
-              </w:rPr>
-              <w:t>OK/KO</w:t>
+            </w:pPr>
+            <w:r>
+              <w:t>R</w:t>
+            </w:r>
+            <w:r>
+              <w:rPr>
+                <w:lang w:val="fr-FR"/>
+              </w:rPr>
+              <w:t>é</w:t>
+            </w:r>
+            <w:proofErr w:type="spellStart"/>
+            <w:r>
+              <w:t>sultat</w:t>
+            </w:r>
+            <w:proofErr w:type="spellEnd"/>
+            <w:r>
+              <w:t xml:space="preserve"> </w:t>
+            </w:r>
+            <w:proofErr w:type="spellStart"/>
+            <w:r>
+              <w:t>obtenu</w:t>
+            </w:r>
+            <w:proofErr w:type="spellEnd"/>
+          </w:p>
+        </w:tc>
+        <w:tc>
+          <w:tcPr>
+            <w:tcW w:w="1446" w:type="dxa"/>
+            <w:vAlign w:val="center"/>
+          </w:tcPr>
+          <w:p>
+            <w:r>
+              <w:t>Suggestion</w:t>
             </w:r>
           </w:p>
         </w:tc>
@@ -1522,35 +1478,23 @@
       <w:tr>
         <w:tc>
           <w:tcPr>
-            <w:tcW w:w="2079" w:type="dxa"/>
+            <w:tcW w:w="1455" w:type="dxa"/>
             <w:vAlign w:val="center"/>
           </w:tcPr>
           <w:p>
             <w:pPr>
               <w:jc w:val="center"/>
-              <w:rPr>
-                <w:lang w:val="en-US"/>
-              </w:rPr>
             </w:pPr>
             <w:proofErr w:type="spellStart"/>
             <w:r>
-              <w:rPr>
-                <w:lang w:val="en-US"/>
-              </w:rPr>
               <w:t>Ajout</w:t>
             </w:r>
             <w:proofErr w:type="spellEnd"/>
             <w:r>
-              <w:rPr>
-                <w:lang w:val="en-US"/>
-              </w:rPr>
               <w:t xml:space="preserve"> de </w:t>
             </w:r>
             <w:proofErr w:type="spellStart"/>
             <w:r>
-              <w:rPr>
-                <w:lang w:val="en-US"/>
-              </w:rPr>
               <w:t>dépense</w:t>
             </w:r>
             <w:proofErr w:type="spellEnd"/>
@@ -1558,16 +1502,19 @@
         </w:tc>
         <w:tc>
           <w:tcPr>
-            <w:tcW w:w="1742" w:type="dxa"/>
+            <w:tcW w:w="1582" w:type="dxa"/>
             <w:vAlign w:val="center"/>
           </w:tcPr>
           <w:p>
             <w:pPr>
               <w:jc w:val="center"/>
-            </w:pPr>
-            <w:r>
-              <w:rPr>
-                <w:lang w:val="en-US"/>
+              <w:rPr>
+                <w:lang w:val="fr-FR"/>
+              </w:rPr>
+            </w:pPr>
+            <w:r>
+              <w:rPr>
+                <w:lang w:val="fr-FR"/>
               </w:rPr>
               <w:t>Application ouverte page de transaction</w:t>
             </w:r>
@@ -1575,7 +1522,7 @@
         </w:tc>
         <w:tc>
           <w:tcPr>
-            <w:tcW w:w="2477" w:type="dxa"/>
+            <w:tcW w:w="2909" w:type="dxa"/>
             <w:vAlign w:val="center"/>
           </w:tcPr>
           <w:p>
@@ -1590,10 +1537,15 @@
               </w:tabs>
             </w:pPr>
             <w:r>
-              <w:rPr>
-                <w:lang w:val="en-US"/>
-              </w:rPr>
-              <w:t>Cliquer “bouton plus”</w:t>
+              <w:t>Cliquer “</w:t>
+            </w:r>
+            <w:proofErr w:type="spellStart"/>
+            <w:r>
+              <w:t>bouton</w:t>
+            </w:r>
+            <w:proofErr w:type="spellEnd"/>
+            <w:r>
+              <w:t xml:space="preserve"> plus”</w:t>
             </w:r>
           </w:p>
           <w:p>
@@ -1606,61 +1558,28 @@
               <w:tabs>
                 <w:tab w:val="center" w:pos="1025"/>
               </w:tabs>
-            </w:pPr>
-            <w:r>
-              <w:t>Remplir</w:t>
-            </w:r>
-            <w:r>
-              <w:rPr>
-                <w:lang w:val="en-US"/>
-              </w:rPr>
-              <w:t xml:space="preserve"> </w:t>
-            </w:r>
-            <w:r>
-              <w:t>Montant=1</w:t>
-            </w:r>
-            <w:r>
-              <w:rPr>
-                <w:lang w:val="en-US"/>
-              </w:rPr>
-              <w:t>0</w:t>
-            </w:r>
-            <w:r>
-              <w:t>00</w:t>
-            </w:r>
-            <w:r>
-              <w:rPr>
-                <w:lang w:val="en-US"/>
-              </w:rPr>
-              <w:t xml:space="preserve"> dans le cellule </w:t>
+              <w:rPr>
+                <w:lang w:val="fr-FR"/>
+              </w:rPr>
+            </w:pPr>
+            <w:r>
+              <w:rPr>
+                <w:lang w:val="fr-FR"/>
+              </w:rPr>
+              <w:t>Remplir Montant=1000 dans le cellule dédié, Motif="</w:t>
             </w:r>
             <w:proofErr w:type="spellStart"/>
             <w:r>
               <w:rPr>
-                <w:lang w:val="en-US"/>
-              </w:rPr>
-              <w:t>dédié</w:t>
+                <w:lang w:val="fr-FR"/>
+              </w:rPr>
+              <w:t>cloture</w:t>
             </w:r>
             <w:proofErr w:type="spellEnd"/>
             <w:r>
-              <w:t xml:space="preserve">, </w:t>
-            </w:r>
-            <w:r>
-              <w:rPr>
-                <w:lang w:val="en-US"/>
-              </w:rPr>
-              <w:t>Motif</w:t>
-            </w:r>
-            <w:r>
-              <w:t>="</w:t>
-            </w:r>
-            <w:r>
-              <w:rPr>
-                <w:lang w:val="en-US"/>
-              </w:rPr>
-              <w:t>cloture</w:t>
-            </w:r>
-            <w:r>
+              <w:rPr>
+                <w:lang w:val="fr-FR"/>
+              </w:rPr>
               <w:t>"</w:t>
             </w:r>
           </w:p>
@@ -1674,16 +1593,18 @@
               <w:jc w:val="center"/>
             </w:pPr>
             <w:r>
-              <w:rPr>
-                <w:lang w:val="en-US"/>
-              </w:rPr>
-              <w:t xml:space="preserve">Clique bouton </w:t>
+              <w:t xml:space="preserve">Clique </w:t>
             </w:r>
             <w:proofErr w:type="spellStart"/>
             <w:r>
-              <w:rPr>
-                <w:lang w:val="en-US"/>
-              </w:rPr>
+              <w:t>bouton</w:t>
+            </w:r>
+            <w:proofErr w:type="spellEnd"/>
+            <w:r>
+              <w:t xml:space="preserve"> </w:t>
+            </w:r>
+            <w:proofErr w:type="spellStart"/>
+            <w:r>
               <w:t>enregistrer</w:t>
             </w:r>
             <w:proofErr w:type="spellEnd"/>
@@ -1691,173 +1612,133 @@
         </w:tc>
         <w:tc>
           <w:tcPr>
-            <w:tcW w:w="1633" w:type="dxa"/>
+            <w:tcW w:w="1362" w:type="dxa"/>
             <w:vAlign w:val="center"/>
           </w:tcPr>
           <w:p>
             <w:pPr>
               <w:jc w:val="center"/>
-            </w:pPr>
-            <w:r>
-              <w:t xml:space="preserve">La </w:t>
+              <w:rPr>
+                <w:lang w:val="fr-FR"/>
+              </w:rPr>
+            </w:pPr>
+            <w:r>
+              <w:rPr>
+                <w:lang w:val="fr-FR"/>
+              </w:rPr>
+              <w:t>La dépense apparaît dans la liste des montants utilisées</w:t>
+            </w:r>
+          </w:p>
+        </w:tc>
+        <w:tc>
+          <w:tcPr>
+            <w:tcW w:w="1416" w:type="dxa"/>
+            <w:vMerge w:val="restart"/>
+            <w:vAlign w:val="center"/>
+          </w:tcPr>
+          <w:p>
+            <w:pPr>
+              <w:ind w:left="360"/>
+              <w:rPr>
+                <w:lang w:val="fr-FR"/>
+              </w:rPr>
+            </w:pPr>
+            <w:r>
+              <w:rPr>
+                <w:b/>
+                <w:lang w:val="fr-FR"/>
+              </w:rPr>
+              <w:t>OK</w:t>
+            </w:r>
+            <w:r>
+              <w:rPr>
+                <w:lang w:val="fr-FR"/>
+              </w:rPr>
+              <w:t xml:space="preserve"> : le montant des soldes restante a bien été à jour</w:t>
+            </w:r>
+          </w:p>
+          <w:p>
+            <w:pPr>
+              <w:ind w:left="360"/>
+              <w:rPr>
+                <w:lang w:val="fr-FR"/>
+              </w:rPr>
+            </w:pPr>
+            <w:r>
+              <w:rPr>
+                <w:b/>
+                <w:lang w:val="fr-FR"/>
+              </w:rPr>
+              <w:t>KO</w:t>
+            </w:r>
+            <w:r>
+              <w:rPr>
+                <w:lang w:val="fr-FR"/>
+              </w:rPr>
+              <w:t xml:space="preserve"> : le montant négatif est ac</w:t>
+            </w:r>
+            <w:bookmarkStart w:id="0" w:name="_GoBack"/>
+            <w:bookmarkEnd w:id="0"/>
+            <w:r>
+              <w:rPr>
+                <w:lang w:val="fr-FR"/>
+              </w:rPr>
+              <w:t>cepté</w:t>
+            </w:r>
+          </w:p>
+        </w:tc>
+        <w:tc>
+          <w:tcPr>
+            <w:tcW w:w="1446" w:type="dxa"/>
+            <w:vMerge w:val="restart"/>
+            <w:vAlign w:val="center"/>
+          </w:tcPr>
+          <w:p>
+            <w:pPr>
+              <w:ind w:left="360"/>
+              <w:rPr>
+                <w:b/>
+                <w:lang w:val="fr-FR"/>
+              </w:rPr>
+            </w:pPr>
+            <w:r>
+              <w:rPr>
+                <w:lang w:val="fr-FR"/>
+              </w:rPr>
+              <w:t xml:space="preserve">Ajouter un contrôle champs pour empêcher de </w:t>
             </w:r>
             <w:proofErr w:type="spellStart"/>
             <w:r>
               <w:rPr>
-                <w:lang w:val="en-US"/>
-              </w:rPr>
-              <w:t>dépense</w:t>
+                <w:lang w:val="fr-FR"/>
+              </w:rPr>
+              <w:t>reçevoir</w:t>
             </w:r>
             <w:proofErr w:type="spellEnd"/>
             <w:r>
-              <w:t xml:space="preserve"> apparaît dans la liste </w:t>
-            </w:r>
-            <w:r>
-              <w:rPr>
-                <w:lang w:val="en-US"/>
-              </w:rPr>
-              <w:t>des</w:t>
-            </w:r>
-            <w:r>
-              <w:t xml:space="preserve"> montant</w:t>
-            </w:r>
-            <w:r>
-              <w:rPr>
-                <w:lang w:val="en-US"/>
-              </w:rPr>
-              <w:t xml:space="preserve">s </w:t>
-            </w:r>
-            <w:proofErr w:type="spellStart"/>
-            <w:r>
-              <w:rPr>
-                <w:lang w:val="en-US"/>
-              </w:rPr>
-              <w:t>utilisées</w:t>
-            </w:r>
-            <w:proofErr w:type="spellEnd"/>
-          </w:p>
-        </w:tc>
-        <w:tc>
-          <w:tcPr>
-            <w:tcW w:w="2149" w:type="dxa"/>
-            <w:vMerge w:val="restart"/>
-            <w:vAlign w:val="center"/>
-          </w:tcPr>
-          <w:p>
-            <w:pPr>
-              <w:pStyle w:val="ListParagraph"/>
-              <w:numPr>
-                <w:ilvl w:val="0"/>
-                <w:numId w:val="7"/>
-              </w:numPr>
-            </w:pPr>
-            <w:r>
-              <w:t>OK : le montant des</w:t>
-            </w:r>
-            <w:r>
-              <w:rPr>
-                <w:lang w:val="en-US"/>
-              </w:rPr>
-              <w:t xml:space="preserve"> </w:t>
-            </w:r>
-            <w:proofErr w:type="spellStart"/>
-            <w:r>
-              <w:rPr>
-                <w:lang w:val="en-US"/>
-              </w:rPr>
-              <w:t>soldes</w:t>
-            </w:r>
-            <w:proofErr w:type="spellEnd"/>
-            <w:r>
-              <w:rPr>
-                <w:lang w:val="en-US"/>
-              </w:rPr>
-              <w:t xml:space="preserve"> restante a bien </w:t>
-            </w:r>
-            <w:proofErr w:type="spellStart"/>
-            <w:r>
-              <w:rPr>
-                <w:lang w:val="en-US"/>
-              </w:rPr>
-              <w:t>été</w:t>
-            </w:r>
-            <w:proofErr w:type="spellEnd"/>
-            <w:r>
-              <w:rPr>
-                <w:lang w:val="en-US"/>
-              </w:rPr>
-              <w:t xml:space="preserve"> à jour</w:t>
-            </w:r>
-          </w:p>
-          <w:p>
-            <w:pPr>
-              <w:pStyle w:val="ListParagraph"/>
-              <w:numPr>
-                <w:ilvl w:val="0"/>
-                <w:numId w:val="7"/>
-              </w:numPr>
-              <w:rPr>
-                <w:lang w:val="en-US"/>
-              </w:rPr>
-            </w:pPr>
-            <w:r>
-              <w:t xml:space="preserve">KO : le montant </w:t>
-            </w:r>
-            <w:proofErr w:type="spellStart"/>
-            <w:r>
-              <w:rPr>
-                <w:lang w:val="en-US"/>
-              </w:rPr>
-              <w:t>négatif</w:t>
-            </w:r>
-            <w:proofErr w:type="spellEnd"/>
-            <w:r>
-              <w:rPr>
-                <w:lang w:val="en-US"/>
-              </w:rPr>
-              <w:t xml:space="preserve"> est </w:t>
-            </w:r>
-            <w:proofErr w:type="spellStart"/>
-            <w:r>
-              <w:rPr>
-                <w:lang w:val="en-US"/>
-              </w:rPr>
-              <w:t>accept</w:t>
-            </w:r>
-            <w:r>
-              <w:rPr>
-                <w:lang w:val="en-US"/>
-              </w:rPr>
-              <w:t>é</w:t>
-            </w:r>
-            <w:proofErr w:type="spellEnd"/>
+              <w:rPr>
+                <w:lang w:val="fr-FR"/>
+              </w:rPr>
+              <w:t xml:space="preserve"> donnée incorrect sur le champs</w:t>
+            </w:r>
           </w:p>
         </w:tc>
       </w:tr>
       <w:tr>
         <w:tc>
           <w:tcPr>
-            <w:tcW w:w="2079" w:type="dxa"/>
+            <w:tcW w:w="1455" w:type="dxa"/>
             <w:vAlign w:val="center"/>
           </w:tcPr>
           <w:p>
             <w:pPr>
               <w:jc w:val="center"/>
-              <w:rPr>
-                <w:lang w:val="en-US"/>
-              </w:rPr>
-            </w:pPr>
-            <w:r>
-              <w:rPr>
-                <w:lang w:val="en-US"/>
-              </w:rPr>
+            </w:pPr>
+            <w:r>
               <w:t xml:space="preserve">Modification de </w:t>
             </w:r>
             <w:proofErr w:type="spellStart"/>
             <w:r>
-              <w:rPr>
-                <w:lang w:val="en-US"/>
-              </w:rPr>
               <w:t>dépense</w:t>
             </w:r>
             <w:proofErr w:type="spellEnd"/>
@@ -1865,77 +1746,27 @@
         </w:tc>
         <w:tc>
           <w:tcPr>
-            <w:tcW w:w="1742" w:type="dxa"/>
+            <w:tcW w:w="1582" w:type="dxa"/>
             <w:vAlign w:val="center"/>
           </w:tcPr>
           <w:p>
             <w:pPr>
               <w:jc w:val="center"/>
               <w:rPr>
-                <w:lang w:val="en-US"/>
-              </w:rPr>
-            </w:pPr>
-            <w:r>
-              <w:rPr>
-                <w:lang w:val="en-US"/>
-              </w:rPr>
-              <w:t xml:space="preserve">Application ouverte sur la page de transaction </w:t>
-            </w:r>
-            <w:proofErr w:type="spellStart"/>
-            <w:r>
-              <w:rPr>
-                <w:lang w:val="en-US"/>
-              </w:rPr>
-              <w:t>puis</w:t>
-            </w:r>
-            <w:proofErr w:type="spellEnd"/>
-            <w:r>
-              <w:rPr>
-                <w:lang w:val="en-US"/>
-              </w:rPr>
-              <w:t xml:space="preserve"> </w:t>
-            </w:r>
-            <w:proofErr w:type="spellStart"/>
-            <w:r>
-              <w:rPr>
-                <w:lang w:val="en-US"/>
-              </w:rPr>
-              <w:t>une</w:t>
-            </w:r>
-            <w:proofErr w:type="spellEnd"/>
-            <w:r>
-              <w:rPr>
-                <w:lang w:val="en-US"/>
-              </w:rPr>
-              <w:t xml:space="preserve"> </w:t>
-            </w:r>
-            <w:proofErr w:type="spellStart"/>
-            <w:r>
-              <w:rPr>
-                <w:lang w:val="en-US"/>
-              </w:rPr>
-              <w:t>dépense</w:t>
-            </w:r>
-            <w:proofErr w:type="spellEnd"/>
-            <w:r>
-              <w:rPr>
-                <w:lang w:val="en-US"/>
-              </w:rPr>
-              <w:t xml:space="preserve"> déjà </w:t>
-            </w:r>
-            <w:proofErr w:type="spellStart"/>
-            <w:r>
-              <w:rPr>
-                <w:lang w:val="en-US"/>
-              </w:rPr>
-              <w:t>définie</w:t>
-            </w:r>
-            <w:proofErr w:type="spellEnd"/>
-          </w:p>
-        </w:tc>
-        <w:tc>
-          <w:tcPr>
-            <w:tcW w:w="2477" w:type="dxa"/>
+                <w:lang w:val="fr-FR"/>
+              </w:rPr>
+            </w:pPr>
+            <w:r>
+              <w:rPr>
+                <w:lang w:val="fr-FR"/>
+              </w:rPr>
+              <w:t>Application ouverte sur la page de transaction puis une dépense déjà définie</w:t>
+            </w:r>
+          </w:p>
+        </w:tc>
+        <w:tc>
+          <w:tcPr>
+            <w:tcW w:w="2909" w:type="dxa"/>
             <w:vAlign w:val="center"/>
           </w:tcPr>
           <w:p>
@@ -1949,56 +1780,30 @@
                 <w:tab w:val="center" w:pos="1025"/>
               </w:tabs>
               <w:rPr>
-                <w:lang w:val="en-US"/>
-              </w:rPr>
-            </w:pPr>
-            <w:r>
-              <w:rPr>
-                <w:lang w:val="en-US"/>
-              </w:rPr>
-              <w:t xml:space="preserve">Cliquer sur la cellule qui </w:t>
+                <w:lang w:val="fr-FR"/>
+              </w:rPr>
+            </w:pPr>
+            <w:r>
+              <w:rPr>
+                <w:lang w:val="fr-FR"/>
+              </w:rPr>
+              <w:t xml:space="preserve">Cliquer sur la cellule qui contient la montant </w:t>
             </w:r>
             <w:proofErr w:type="spellStart"/>
-            <w:r>
-              <w:rPr>
-                <w:lang w:val="en-US"/>
-              </w:rPr>
-              <w:t>contient</w:t>
+            <w:proofErr w:type="gramStart"/>
+            <w:r>
+              <w:rPr>
+                <w:lang w:val="fr-FR"/>
+              </w:rPr>
+              <w:t>a</w:t>
             </w:r>
             <w:proofErr w:type="spellEnd"/>
-            <w:r>
-              <w:rPr>
-                <w:lang w:val="en-US"/>
-              </w:rPr>
-              <w:t xml:space="preserve"> la </w:t>
-            </w:r>
-            <w:proofErr w:type="spellStart"/>
-            <w:r>
-              <w:rPr>
-                <w:lang w:val="en-US"/>
-              </w:rPr>
-              <w:t>montant</w:t>
-            </w:r>
-            <w:proofErr w:type="spellEnd"/>
-            <w:r>
-              <w:rPr>
-                <w:lang w:val="en-US"/>
-              </w:rPr>
-              <w:t xml:space="preserve"> a changer </w:t>
-            </w:r>
-            <w:proofErr w:type="spellStart"/>
-            <w:r>
-              <w:rPr>
-                <w:lang w:val="en-US"/>
-              </w:rPr>
-              <w:t>puis</w:t>
-            </w:r>
-            <w:proofErr w:type="spellEnd"/>
-            <w:r>
-              <w:rPr>
-                <w:lang w:val="en-US"/>
-              </w:rPr>
-              <w:t xml:space="preserve"> on entre 500</w:t>
+            <w:proofErr w:type="gramEnd"/>
+            <w:r>
+              <w:rPr>
+                <w:lang w:val="fr-FR"/>
+              </w:rPr>
+              <w:t xml:space="preserve"> changer puis on entre 500</w:t>
             </w:r>
           </w:p>
           <w:p>
@@ -2011,21 +1816,20 @@
               <w:tabs>
                 <w:tab w:val="center" w:pos="1025"/>
               </w:tabs>
-              <w:rPr>
-                <w:lang w:val="en-US"/>
-              </w:rPr>
-            </w:pPr>
-            <w:r>
-              <w:rPr>
-                <w:lang w:val="en-US"/>
-              </w:rPr>
-              <w:t xml:space="preserve">Clique bouton </w:t>
+            </w:pPr>
+            <w:r>
+              <w:t xml:space="preserve">Clique </w:t>
             </w:r>
             <w:proofErr w:type="spellStart"/>
             <w:r>
-              <w:rPr>
-                <w:lang w:val="en-US"/>
-              </w:rPr>
+              <w:t>bouton</w:t>
+            </w:r>
+            <w:proofErr w:type="spellEnd"/>
+            <w:r>
+              <w:t xml:space="preserve"> </w:t>
+            </w:r>
+            <w:proofErr w:type="spellStart"/>
+            <w:r>
               <w:t>enregistrer</w:t>
             </w:r>
             <w:proofErr w:type="spellEnd"/>
@@ -2033,87 +1837,47 @@
         </w:tc>
         <w:tc>
           <w:tcPr>
-            <w:tcW w:w="1633" w:type="dxa"/>
+            <w:tcW w:w="1362" w:type="dxa"/>
             <w:vAlign w:val="center"/>
           </w:tcPr>
           <w:p>
             <w:pPr>
               <w:jc w:val="center"/>
-            </w:pPr>
-            <w:r>
-              <w:rPr>
-                <w:lang w:val="en-US"/>
-              </w:rPr>
-              <w:t xml:space="preserve">Dans la </w:t>
-            </w:r>
-            <w:proofErr w:type="spellStart"/>
-            <w:r>
-              <w:rPr>
-                <w:lang w:val="en-US"/>
-              </w:rPr>
-              <w:t>liste</w:t>
-            </w:r>
-            <w:proofErr w:type="spellEnd"/>
-            <w:r>
-              <w:rPr>
-                <w:lang w:val="en-US"/>
-              </w:rPr>
-              <w:t xml:space="preserve"> des </w:t>
-            </w:r>
-            <w:proofErr w:type="spellStart"/>
-            <w:r>
-              <w:rPr>
-                <w:lang w:val="en-US"/>
-              </w:rPr>
-              <w:t>montants</w:t>
-            </w:r>
-            <w:proofErr w:type="spellEnd"/>
-            <w:r>
-              <w:rPr>
-                <w:lang w:val="en-US"/>
-              </w:rPr>
-              <w:t xml:space="preserve"> </w:t>
-            </w:r>
-            <w:proofErr w:type="spellStart"/>
-            <w:r>
-              <w:rPr>
-                <w:lang w:val="en-US"/>
-              </w:rPr>
-              <w:t>utilisé</w:t>
-            </w:r>
-            <w:proofErr w:type="spellEnd"/>
-            <w:r>
-              <w:rPr>
-                <w:lang w:val="en-US"/>
-              </w:rPr>
-              <w:t xml:space="preserve"> la </w:t>
-            </w:r>
-            <w:proofErr w:type="spellStart"/>
-            <w:r>
-              <w:rPr>
-                <w:lang w:val="en-US"/>
-              </w:rPr>
-              <w:t>dépense</w:t>
-            </w:r>
-            <w:proofErr w:type="spellEnd"/>
-            <w:r>
-              <w:rPr>
-                <w:lang w:val="en-US"/>
-              </w:rPr>
-              <w:t xml:space="preserve"> se met à jour</w:t>
-            </w:r>
-          </w:p>
-        </w:tc>
-        <w:tc>
-          <w:tcPr>
-            <w:tcW w:w="2149" w:type="dxa"/>
+              <w:rPr>
+                <w:lang w:val="fr-FR"/>
+              </w:rPr>
+            </w:pPr>
+            <w:r>
+              <w:rPr>
+                <w:lang w:val="fr-FR"/>
+              </w:rPr>
+              <w:t>Dans la liste des montants utilisé la dépense se met à jour</w:t>
+            </w:r>
+          </w:p>
+        </w:tc>
+        <w:tc>
+          <w:tcPr>
+            <w:tcW w:w="1416" w:type="dxa"/>
             <w:vMerge/>
             <w:vAlign w:val="center"/>
           </w:tcPr>
           <w:p>
             <w:pPr>
               <w:rPr>
-                <w:lang w:val="en-US"/>
+                <w:lang w:val="fr-FR"/>
+              </w:rPr>
+            </w:pPr>
+          </w:p>
+        </w:tc>
+        <w:tc>
+          <w:tcPr>
+            <w:tcW w:w="1446" w:type="dxa"/>
+            <w:vMerge/>
+          </w:tcPr>
+          <w:p>
+            <w:pPr>
+              <w:rPr>
+                <w:lang w:val="fr-FR"/>
               </w:rPr>
             </w:pPr>
           </w:p>
@@ -2123,75 +1887,77 @@
     <w:p>
       <w:pPr>
         <w:rPr>
-          <w:lang w:val="en-US"/>
+          <w:lang w:val="fr-FR"/>
         </w:rPr>
       </w:pPr>
     </w:p>
     <w:p>
       <w:pPr>
         <w:rPr>
-          <w:lang w:val="en-US"/>
-        </w:rPr>
-      </w:pPr>
-      <w:r>
-        <w:rPr>
-          <w:b/>
-          <w:bCs/>
+          <w:lang w:val="fr-FR"/>
+        </w:rPr>
+      </w:pPr>
+      <w:r>
+        <w:rPr>
+          <w:b/>
+          <w:bCs/>
+          <w:lang w:val="fr-FR"/>
         </w:rPr>
         <w:t xml:space="preserve">Scénario 3 : </w:t>
       </w:r>
       <w:r>
+        <w:rPr>
+          <w:lang w:val="fr-FR"/>
+        </w:rPr>
         <w:t>Calculs Automatiques</w:t>
       </w:r>
     </w:p>
     <w:p>
       <w:pPr>
         <w:rPr>
-          <w:lang w:val="en-US"/>
-        </w:rPr>
-      </w:pPr>
-      <w:r>
-        <w:rPr>
-          <w:b/>
-          <w:bCs/>
+          <w:lang w:val="fr-FR"/>
+        </w:rPr>
+      </w:pPr>
+      <w:r>
+        <w:rPr>
+          <w:b/>
+          <w:bCs/>
+          <w:lang w:val="fr-FR"/>
         </w:rPr>
         <w:t xml:space="preserve">Objectif : </w:t>
       </w:r>
       <w:r>
+        <w:rPr>
+          <w:lang w:val="fr-FR"/>
+        </w:rPr>
         <w:t>Vérifier l'exactitude des calculs</w:t>
       </w:r>
     </w:p>
     <w:tbl>
       <w:tblPr>
         <w:tblStyle w:val="TableGrid"/>
-        <w:tblW w:w="10170" w:type="dxa"/>
+        <w:tblW w:w="9180" w:type="dxa"/>
         <w:tblInd w:w="-635" w:type="dxa"/>
         <w:tblLook w:val="04A0" w:firstRow="1" w:lastRow="0" w:firstColumn="1" w:lastColumn="0" w:noHBand="0" w:noVBand="1"/>
       </w:tblPr>
       <w:tblGrid>
-        <w:gridCol w:w="2222"/>
+        <w:gridCol w:w="1650"/>
         <w:gridCol w:w="2635"/>
-        <w:gridCol w:w="1661"/>
-        <w:gridCol w:w="1651"/>
-        <w:gridCol w:w="2001"/>
+        <w:gridCol w:w="1275"/>
+        <w:gridCol w:w="1428"/>
+        <w:gridCol w:w="2192"/>
       </w:tblGrid>
       <w:tr>
         <w:tc>
           <w:tcPr>
-            <w:tcW w:w="2222" w:type="dxa"/>
+            <w:tcW w:w="2129" w:type="dxa"/>
             <w:vAlign w:val="center"/>
           </w:tcPr>
           <w:p>
             <w:pPr>
               <w:jc w:val="center"/>
-              <w:rPr>
-                <w:lang w:val="en-US"/>
-              </w:rPr>
-            </w:pPr>
-            <w:r>
-              <w:rPr>
-                <w:lang w:val="en-US"/>
-              </w:rPr>
+            </w:pPr>
+            <w:r>
               <w:t>Description</w:t>
             </w:r>
           </w:p>
@@ -2204,9 +1970,6 @@
           <w:p>
             <w:pPr>
               <w:jc w:val="center"/>
-              <w:rPr>
-                <w:lang w:val="en-US"/>
-              </w:rPr>
             </w:pPr>
             <w:r>
               <w:t>Données de test</w:t>
@@ -2215,15 +1978,12 @@
         </w:tc>
         <w:tc>
           <w:tcPr>
-            <w:tcW w:w="1661" w:type="dxa"/>
+            <w:tcW w:w="1599" w:type="dxa"/>
             <w:vAlign w:val="center"/>
           </w:tcPr>
           <w:p>
             <w:pPr>
               <w:jc w:val="center"/>
-              <w:rPr>
-                <w:lang w:val="en-US"/>
-              </w:rPr>
             </w:pPr>
             <w:r>
               <w:t>Étapes à exécuter</w:t>
@@ -2232,15 +1992,12 @@
         </w:tc>
         <w:tc>
           <w:tcPr>
-            <w:tcW w:w="1651" w:type="dxa"/>
+            <w:tcW w:w="1615" w:type="dxa"/>
             <w:vAlign w:val="center"/>
           </w:tcPr>
           <w:p>
             <w:pPr>
               <w:jc w:val="center"/>
-              <w:rPr>
-                <w:lang w:val="en-US"/>
-              </w:rPr>
             </w:pPr>
             <w:r>
               <w:t>Résultat attendu</w:t>
@@ -2249,64 +2006,65 @@
         </w:tc>
         <w:tc>
           <w:tcPr>
-            <w:tcW w:w="2001" w:type="dxa"/>
+            <w:tcW w:w="1202" w:type="dxa"/>
             <w:vAlign w:val="center"/>
           </w:tcPr>
           <w:p>
             <w:pPr>
               <w:jc w:val="center"/>
-              <w:rPr>
-                <w:lang w:val="en-US"/>
-              </w:rPr>
-            </w:pPr>
-            <w:r>
-              <w:rPr>
-                <w:lang w:val="en-US"/>
-              </w:rPr>
-              <w:t>OK/KO</w:t>
-            </w:r>
+            </w:pPr>
+            <w:r>
+              <w:t>R</w:t>
+            </w:r>
+            <w:r>
+              <w:rPr>
+                <w:lang w:val="fr-FR"/>
+              </w:rPr>
+              <w:t>é</w:t>
+            </w:r>
+            <w:proofErr w:type="spellStart"/>
+            <w:r>
+              <w:t>sultat</w:t>
+            </w:r>
+            <w:proofErr w:type="spellEnd"/>
+            <w:r>
+              <w:t xml:space="preserve"> </w:t>
+            </w:r>
+            <w:proofErr w:type="spellStart"/>
+            <w:r>
+              <w:t>o</w:t>
+            </w:r>
+            <w:r>
+              <w:t>btenu</w:t>
+            </w:r>
+            <w:proofErr w:type="spellEnd"/>
           </w:p>
         </w:tc>
       </w:tr>
       <w:tr>
         <w:tc>
           <w:tcPr>
-            <w:tcW w:w="2222" w:type="dxa"/>
+            <w:tcW w:w="2129" w:type="dxa"/>
             <w:vAlign w:val="center"/>
           </w:tcPr>
           <w:p>
             <w:pPr>
               <w:jc w:val="center"/>
-              <w:rPr>
-                <w:lang w:val="en-US"/>
-              </w:rPr>
             </w:pPr>
             <w:proofErr w:type="spellStart"/>
             <w:r>
-              <w:rPr>
-                <w:lang w:val="en-US"/>
-              </w:rPr>
               <w:t>Calcul</w:t>
             </w:r>
             <w:proofErr w:type="spellEnd"/>
             <w:r>
-              <w:rPr>
-                <w:lang w:val="en-US"/>
-              </w:rPr>
               <w:t xml:space="preserve"> </w:t>
             </w:r>
             <w:proofErr w:type="spellStart"/>
             <w:r>
-              <w:rPr>
-                <w:lang w:val="en-US"/>
-              </w:rPr>
               <w:t>solde</w:t>
             </w:r>
             <w:proofErr w:type="spellEnd"/>
             <w:r>
-              <w:rPr>
-                <w:lang w:val="en-US"/>
-              </w:rPr>
               <w:t xml:space="preserve"> global</w:t>
             </w:r>
           </w:p>
@@ -2343,7 +2101,7 @@
         </w:tc>
         <w:tc>
           <w:tcPr>
-            <w:tcW w:w="1661" w:type="dxa"/>
+            <w:tcW w:w="1599" w:type="dxa"/>
             <w:vAlign w:val="center"/>
           </w:tcPr>
           <w:p>
@@ -2354,7 +2112,7 @@
         </w:tc>
         <w:tc>
           <w:tcPr>
-            <w:tcW w:w="1651" w:type="dxa"/>
+            <w:tcW w:w="1615" w:type="dxa"/>
             <w:vAlign w:val="center"/>
           </w:tcPr>
           <w:p>
@@ -2368,31 +2126,54 @@
         </w:tc>
         <w:tc>
           <w:tcPr>
-            <w:tcW w:w="2001" w:type="dxa"/>
-            <w:vAlign w:val="center"/>
-          </w:tcPr>
-          <w:p>
-            <w:pPr>
+            <w:tcW w:w="1202" w:type="dxa"/>
+            <w:vAlign w:val="center"/>
+          </w:tcPr>
+          <w:p>
+            <w:pPr>
+              <w:pStyle w:val="ListParagraph"/>
+              <w:numPr>
+                <w:ilvl w:val="0"/>
+                <w:numId w:val="12"/>
+              </w:numPr>
               <w:jc w:val="center"/>
-              <w:rPr>
-                <w:lang w:val="en-US"/>
-              </w:rPr>
-            </w:pPr>
+            </w:pPr>
+            <w:r>
+              <w:t xml:space="preserve">OK: </w:t>
+            </w:r>
+            <w:proofErr w:type="spellStart"/>
+            <w:r>
+              <w:t>calcul</w:t>
+            </w:r>
+            <w:proofErr w:type="spellEnd"/>
+            <w:r>
+              <w:t xml:space="preserve"> </w:t>
+            </w:r>
+            <w:proofErr w:type="spellStart"/>
+            <w:r>
+              <w:t>automatique</w:t>
+            </w:r>
+            <w:proofErr w:type="spellEnd"/>
+            <w:r>
+              <w:t xml:space="preserve"> </w:t>
+            </w:r>
+            <w:proofErr w:type="spellStart"/>
+            <w:r>
+              <w:t>correcte</w:t>
+            </w:r>
+            <w:proofErr w:type="spellEnd"/>
           </w:p>
         </w:tc>
       </w:tr>
       <w:tr>
         <w:tc>
           <w:tcPr>
-            <w:tcW w:w="2222" w:type="dxa"/>
+            <w:tcW w:w="2129" w:type="dxa"/>
             <w:vAlign w:val="center"/>
           </w:tcPr>
           <w:p>
             <w:pPr>
               <w:jc w:val="center"/>
-              <w:rPr>
-                <w:lang w:val="en-US"/>
-              </w:rPr>
             </w:pPr>
             <w:r>
               <w:t>Calcul par catégorie</w:t>
@@ -2431,7 +2212,7 @@
         </w:tc>
         <w:tc>
           <w:tcPr>
-            <w:tcW w:w="1661" w:type="dxa"/>
+            <w:tcW w:w="1599" w:type="dxa"/>
             <w:vAlign w:val="center"/>
           </w:tcPr>
           <w:p>
@@ -2442,7 +2223,7 @@
         </w:tc>
         <w:tc>
           <w:tcPr>
-            <w:tcW w:w="1651" w:type="dxa"/>
+            <w:tcW w:w="1615" w:type="dxa"/>
             <w:vAlign w:val="center"/>
           </w:tcPr>
           <w:p>
@@ -2456,16 +2237,27 @@
         </w:tc>
         <w:tc>
           <w:tcPr>
-            <w:tcW w:w="2001" w:type="dxa"/>
-            <w:vAlign w:val="center"/>
-          </w:tcPr>
-          <w:p>
-            <w:pPr>
+            <w:tcW w:w="1202" w:type="dxa"/>
+            <w:vAlign w:val="center"/>
+          </w:tcPr>
+          <w:p>
+            <w:pPr>
+              <w:pStyle w:val="ListParagraph"/>
+              <w:numPr>
+                <w:ilvl w:val="0"/>
+                <w:numId w:val="12"/>
+              </w:numPr>
               <w:jc w:val="center"/>
               <w:rPr>
-                <w:lang w:val="en-US"/>
-              </w:rPr>
-            </w:pPr>
+                <w:lang w:val="fr-FR"/>
+              </w:rPr>
+            </w:pPr>
+            <w:r>
+              <w:rPr>
+                <w:lang w:val="fr-FR"/>
+              </w:rPr>
+              <w:t>Ok: calcul par catégorie correcte</w:t>
+            </w:r>
           </w:p>
         </w:tc>
       </w:tr>
@@ -2473,22 +2265,16 @@
     <w:p>
       <w:pPr>
         <w:rPr>
-          <w:lang w:val="en-US"/>
+          <w:lang w:val="fr-FR"/>
         </w:rPr>
       </w:pPr>
     </w:p>
     <w:p>
-      <w:pPr>
-        <w:rPr>
-          <w:lang w:val="en-US"/>
-        </w:rPr>
-      </w:pPr>
       <w:proofErr w:type="spellStart"/>
       <w:r>
         <w:rPr>
           <w:b/>
           <w:bCs/>
-          <w:lang w:val="en-US"/>
         </w:rPr>
         <w:t>Scénario</w:t>
       </w:r>
@@ -2497,7 +2283,6 @@
         <w:rPr>
           <w:b/>
           <w:bCs/>
-          <w:lang w:val="en-US"/>
         </w:rPr>
         <w:t xml:space="preserve"> </w:t>
       </w:r>
@@ -2506,7 +2291,6 @@
         <w:rPr>
           <w:b/>
           <w:bCs/>
-          <w:lang w:val="en-US"/>
         </w:rPr>
         <w:t>4 :</w:t>
       </w:r>
@@ -2515,49 +2299,44 @@
         <w:rPr>
           <w:b/>
           <w:bCs/>
-          <w:lang w:val="en-US"/>
         </w:rPr>
         <w:t xml:space="preserve"> </w:t>
       </w:r>
-      <w:r>
-        <w:rPr>
-          <w:lang w:val="en-US"/>
-        </w:rPr>
-        <w:t>Gestion des données</w:t>
+      <w:proofErr w:type="spellStart"/>
+      <w:r>
+        <w:t>Gestion</w:t>
+      </w:r>
+      <w:proofErr w:type="spellEnd"/>
+      <w:r>
+        <w:t xml:space="preserve"> des données</w:t>
       </w:r>
     </w:p>
     <w:p>
-      <w:pPr>
-        <w:rPr>
-          <w:lang w:val="en-US"/>
-        </w:rPr>
-      </w:pPr>
-      <w:r>
-        <w:rPr>
-          <w:b/>
-          <w:bCs/>
-          <w:lang w:val="en-US"/>
-        </w:rPr>
-        <w:t>Objectif:</w:t>
-      </w:r>
-      <w:r>
-        <w:rPr>
-          <w:lang w:val="en-US"/>
-        </w:rPr>
+      <w:proofErr w:type="spellStart"/>
+      <w:r>
+        <w:rPr>
+          <w:b/>
+          <w:bCs/>
+        </w:rPr>
+        <w:t>Objectif</w:t>
+      </w:r>
+      <w:proofErr w:type="spellEnd"/>
+      <w:r>
+        <w:rPr>
+          <w:b/>
+          <w:bCs/>
+        </w:rPr>
+        <w:t>:</w:t>
+      </w:r>
+      <w:r>
         <w:t xml:space="preserve"> </w:t>
       </w:r>
       <w:proofErr w:type="spellStart"/>
       <w:r>
-        <w:rPr>
-          <w:lang w:val="en-US"/>
-        </w:rPr>
         <w:t>Vérifier</w:t>
       </w:r>
       <w:proofErr w:type="spellEnd"/>
       <w:r>
-        <w:rPr>
-          <w:lang w:val="en-US"/>
-        </w:rPr>
         <w:t xml:space="preserve"> la persistence</w:t>
       </w:r>
     </w:p>
@@ -2582,14 +2361,8 @@
           <w:p>
             <w:pPr>
               <w:jc w:val="center"/>
-              <w:rPr>
-                <w:lang w:val="en-US"/>
-              </w:rPr>
-            </w:pPr>
-            <w:r>
-              <w:rPr>
-                <w:lang w:val="en-US"/>
-              </w:rPr>
+            </w:pPr>
+            <w:r>
               <w:t>Description</w:t>
             </w:r>
           </w:p>
@@ -2602,14 +2375,8 @@
           <w:p>
             <w:pPr>
               <w:jc w:val="center"/>
-              <w:rPr>
-                <w:lang w:val="en-US"/>
-              </w:rPr>
-            </w:pPr>
-            <w:r>
-              <w:rPr>
-                <w:lang w:val="en-US"/>
-              </w:rPr>
+            </w:pPr>
+            <w:r>
               <w:t>Étapes</w:t>
             </w:r>
           </w:p>
@@ -2622,41 +2389,23 @@
           <w:p>
             <w:pPr>
               <w:jc w:val="center"/>
-              <w:rPr>
-                <w:lang w:val="en-US"/>
-              </w:rPr>
             </w:pPr>
             <w:proofErr w:type="spellStart"/>
             <w:r>
-              <w:rPr>
-                <w:lang w:val="en-US"/>
-              </w:rPr>
               <w:t>R</w:t>
             </w:r>
             <w:r>
-              <w:rPr>
-                <w:lang w:val="en-US"/>
-              </w:rPr>
               <w:t>é</w:t>
             </w:r>
             <w:r>
-              <w:rPr>
-                <w:lang w:val="en-US"/>
-              </w:rPr>
               <w:t>sultat</w:t>
             </w:r>
             <w:proofErr w:type="spellEnd"/>
             <w:r>
-              <w:rPr>
-                <w:lang w:val="en-US"/>
-              </w:rPr>
               <w:t xml:space="preserve"> </w:t>
             </w:r>
             <w:proofErr w:type="spellStart"/>
             <w:r>
-              <w:rPr>
-                <w:lang w:val="en-US"/>
-              </w:rPr>
               <w:t>attendu</w:t>
             </w:r>
             <w:proofErr w:type="spellEnd"/>
@@ -2670,16 +2419,29 @@
           <w:p>
             <w:pPr>
               <w:jc w:val="center"/>
-              <w:rPr>
-                <w:lang w:val="en-US"/>
-              </w:rPr>
-            </w:pPr>
-            <w:r>
-              <w:rPr>
-                <w:lang w:val="en-US"/>
-              </w:rPr>
-              <w:t>OK/KO</w:t>
-            </w:r>
+            </w:pPr>
+            <w:r>
+              <w:t>R</w:t>
+            </w:r>
+            <w:r>
+              <w:rPr>
+                <w:lang w:val="fr-FR"/>
+              </w:rPr>
+              <w:t>é</w:t>
+            </w:r>
+            <w:proofErr w:type="spellStart"/>
+            <w:r>
+              <w:t>sultat</w:t>
+            </w:r>
+            <w:proofErr w:type="spellEnd"/>
+            <w:r>
+              <w:t xml:space="preserve"> </w:t>
+            </w:r>
+            <w:proofErr w:type="spellStart"/>
+            <w:r>
+              <w:t>obtenu</w:t>
+            </w:r>
+            <w:proofErr w:type="spellEnd"/>
           </w:p>
         </w:tc>
       </w:tr>
@@ -2692,24 +2454,20 @@
           <w:p>
             <w:pPr>
               <w:jc w:val="center"/>
-              <w:rPr>
-                <w:lang w:val="en-US"/>
-              </w:rPr>
             </w:pPr>
             <w:proofErr w:type="spellStart"/>
             <w:r>
-              <w:rPr>
-                <w:lang w:val="en-US"/>
-              </w:rPr>
               <w:t>Persistance</w:t>
             </w:r>
             <w:proofErr w:type="spellEnd"/>
             <w:r>
-              <w:rPr>
-                <w:lang w:val="en-US"/>
-              </w:rPr>
-              <w:t xml:space="preserve"> données</w:t>
-            </w:r>
+              <w:t xml:space="preserve"> </w:t>
+            </w:r>
+            <w:proofErr w:type="spellStart"/>
+            <w:r>
+              <w:t>données</w:t>
+            </w:r>
+            <w:proofErr w:type="spellEnd"/>
           </w:p>
         </w:tc>
         <w:tc>
@@ -2725,22 +2483,13 @@
                 <w:numId w:val="10"/>
               </w:numPr>
               <w:jc w:val="center"/>
-              <w:rPr>
-                <w:lang w:val="en-US"/>
-              </w:rPr>
             </w:pPr>
             <w:proofErr w:type="spellStart"/>
             <w:r>
-              <w:rPr>
-                <w:lang w:val="en-US"/>
-              </w:rPr>
               <w:t>Ajouter</w:t>
             </w:r>
             <w:proofErr w:type="spellEnd"/>
             <w:r>
-              <w:rPr>
-                <w:lang w:val="en-US"/>
-              </w:rPr>
               <w:t xml:space="preserve"> </w:t>
             </w:r>
           </w:p>
@@ -2752,21 +2501,17 @@
                 <w:numId w:val="10"/>
               </w:numPr>
               <w:jc w:val="center"/>
-              <w:rPr>
-                <w:lang w:val="en-US"/>
-              </w:rPr>
-            </w:pPr>
-            <w:r>
-              <w:rPr>
-                <w:lang w:val="en-US"/>
-              </w:rPr>
-              <w:t xml:space="preserve">Fermer </w:t>
-            </w:r>
+            </w:pPr>
             <w:proofErr w:type="spellStart"/>
             <w:r>
-              <w:rPr>
-                <w:lang w:val="en-US"/>
-              </w:rPr>
+              <w:t>Fermer</w:t>
+            </w:r>
+            <w:proofErr w:type="spellEnd"/>
+            <w:r>
+              <w:t xml:space="preserve"> </w:t>
+            </w:r>
+            <w:proofErr w:type="spellStart"/>
+            <w:r>
               <w:t>apppli</w:t>
             </w:r>
             <w:proofErr w:type="spellEnd"/>
@@ -2779,15 +2524,9 @@
                 <w:numId w:val="10"/>
               </w:numPr>
               <w:jc w:val="center"/>
-              <w:rPr>
-                <w:lang w:val="en-US"/>
-              </w:rPr>
             </w:pPr>
             <w:proofErr w:type="spellStart"/>
             <w:r>
-              <w:rPr>
-                <w:lang w:val="en-US"/>
-              </w:rPr>
               <w:t>Rouvrir</w:t>
             </w:r>
             <w:proofErr w:type="spellEnd"/>
@@ -2802,37 +2541,29 @@
             <w:pPr>
               <w:jc w:val="center"/>
               <w:rPr>
-                <w:lang w:val="en-US"/>
-              </w:rPr>
-            </w:pPr>
-            <w:r>
-              <w:rPr>
-                <w:lang w:val="en-US"/>
-              </w:rPr>
-              <w:t xml:space="preserve">La resource est </w:t>
+                <w:lang w:val="fr-FR"/>
+              </w:rPr>
+            </w:pPr>
+            <w:r>
+              <w:rPr>
+                <w:lang w:val="fr-FR"/>
+              </w:rPr>
+              <w:t xml:space="preserve">La </w:t>
             </w:r>
             <w:proofErr w:type="spellStart"/>
             <w:r>
               <w:rPr>
-                <w:lang w:val="en-US"/>
-              </w:rPr>
-              <w:t>toujours</w:t>
+                <w:lang w:val="fr-FR"/>
+              </w:rPr>
+              <w:t>resource</w:t>
             </w:r>
             <w:proofErr w:type="spellEnd"/>
             <w:r>
               <w:rPr>
-                <w:lang w:val="en-US"/>
-              </w:rPr>
-              <w:t xml:space="preserve"> </w:t>
-            </w:r>
-            <w:proofErr w:type="spellStart"/>
-            <w:r>
-              <w:rPr>
-                <w:lang w:val="en-US"/>
-              </w:rPr>
-              <w:t>présente</w:t>
-            </w:r>
-            <w:proofErr w:type="spellEnd"/>
+                <w:lang w:val="fr-FR"/>
+              </w:rPr>
+              <w:t xml:space="preserve"> est toujours présente</w:t>
+            </w:r>
           </w:p>
         </w:tc>
         <w:tc>
@@ -2844,9 +2575,15 @@
             <w:pPr>
               <w:jc w:val="center"/>
               <w:rPr>
-                <w:lang w:val="en-US"/>
-              </w:rPr>
-            </w:pPr>
+                <w:lang w:val="fr-FR"/>
+              </w:rPr>
+            </w:pPr>
+            <w:r>
+              <w:rPr>
+                <w:lang w:val="fr-FR"/>
+              </w:rPr>
+              <w:t>OK : les données restent toujours comme son état avant la fermeture</w:t>
+            </w:r>
           </w:p>
         </w:tc>
       </w:tr>
@@ -2859,61 +2596,115 @@
           <w:p>
             <w:pPr>
               <w:jc w:val="center"/>
-              <w:rPr>
-                <w:lang w:val="en-US"/>
-              </w:rPr>
-            </w:pPr>
-            <w:r>
+            </w:pPr>
+            <w:proofErr w:type="spellStart"/>
+            <w:r>
+              <w:t>Intégrité</w:t>
+            </w:r>
+            <w:proofErr w:type="spellEnd"/>
+            <w:r>
+              <w:t xml:space="preserve"> </w:t>
+            </w:r>
+            <w:proofErr w:type="spellStart"/>
+            <w:r>
+              <w:t>données</w:t>
+            </w:r>
+            <w:proofErr w:type="spellEnd"/>
+          </w:p>
+        </w:tc>
+        <w:tc>
+          <w:tcPr>
+            <w:tcW w:w="2265" w:type="dxa"/>
+            <w:vAlign w:val="center"/>
+          </w:tcPr>
+          <w:p>
+            <w:pPr>
+              <w:rPr>
+                <w:lang w:val="fr-FR"/>
+              </w:rPr>
+            </w:pPr>
+            <w:r>
+              <w:rPr>
+                <w:lang w:val="fr-FR"/>
+              </w:rPr>
+              <w:t>Modifier plusieurs fois mêmes données</w:t>
+            </w:r>
+          </w:p>
+        </w:tc>
+        <w:tc>
+          <w:tcPr>
+            <w:tcW w:w="2266" w:type="dxa"/>
+            <w:vAlign w:val="center"/>
+          </w:tcPr>
+          <w:p>
+            <w:pPr>
+              <w:jc w:val="center"/>
+            </w:pPr>
+            <w:r>
+              <w:t xml:space="preserve">Les </w:t>
+            </w:r>
+            <w:proofErr w:type="spellStart"/>
+            <w:r>
+              <w:t>calculs</w:t>
+            </w:r>
+            <w:proofErr w:type="spellEnd"/>
+            <w:r>
+              <w:t xml:space="preserve"> </w:t>
+            </w:r>
+            <w:proofErr w:type="spellStart"/>
+            <w:r>
+              <w:t>restent</w:t>
+            </w:r>
+            <w:proofErr w:type="spellEnd"/>
+            <w:r>
+              <w:t xml:space="preserve"> </w:t>
+            </w:r>
+            <w:proofErr w:type="spellStart"/>
+            <w:r>
+              <w:t>cohérents</w:t>
+            </w:r>
+            <w:proofErr w:type="spellEnd"/>
+          </w:p>
+        </w:tc>
+        <w:tc>
+          <w:tcPr>
+            <w:tcW w:w="2266" w:type="dxa"/>
+            <w:vAlign w:val="center"/>
+          </w:tcPr>
+          <w:p>
+            <w:pPr>
+              <w:jc w:val="center"/>
+              <w:rPr>
+                <w:lang w:val="fr-FR"/>
+              </w:rPr>
+            </w:pPr>
+            <w:r>
+              <w:rPr>
+                <w:lang w:val="fr-FR"/>
+              </w:rPr>
+              <w:t xml:space="preserve">Ok : le nombre de modification ne fait </w:t>
+            </w:r>
+            <w:r>
+              <w:rPr>
+                <w:lang w:val="fr-FR"/>
+              </w:rPr>
               <w:lastRenderedPageBreak/>
-              <w:t>Intégrité données</w:t>
-            </w:r>
-          </w:p>
-        </w:tc>
-        <w:tc>
-          <w:tcPr>
-            <w:tcW w:w="2265" w:type="dxa"/>
-            <w:vAlign w:val="center"/>
-          </w:tcPr>
-          <w:p>
-            <w:pPr>
-              <w:rPr>
-                <w:lang w:val="en-US"/>
-              </w:rPr>
-            </w:pPr>
-            <w:r>
-              <w:t>Modifier plusieurs fois mêmes données</w:t>
-            </w:r>
-          </w:p>
-        </w:tc>
-        <w:tc>
-          <w:tcPr>
-            <w:tcW w:w="2266" w:type="dxa"/>
-            <w:vAlign w:val="center"/>
-          </w:tcPr>
-          <w:p>
-            <w:pPr>
-              <w:jc w:val="center"/>
-              <w:rPr>
-                <w:lang w:val="en-US"/>
-              </w:rPr>
-            </w:pPr>
-            <w:r>
-              <w:t>Les calculs restent cohérents</w:t>
-            </w:r>
-          </w:p>
-        </w:tc>
-        <w:tc>
-          <w:tcPr>
-            <w:tcW w:w="2266" w:type="dxa"/>
-            <w:vAlign w:val="center"/>
-          </w:tcPr>
-          <w:p>
-            <w:pPr>
-              <w:jc w:val="center"/>
-              <w:rPr>
-                <w:lang w:val="en-US"/>
-              </w:rPr>
-            </w:pPr>
+              <w:t xml:space="preserve">pas </w:t>
+            </w:r>
+            <w:proofErr w:type="spellStart"/>
+            <w:r>
+              <w:rPr>
+                <w:lang w:val="fr-FR"/>
+              </w:rPr>
+              <w:t>bugger</w:t>
+            </w:r>
+            <w:proofErr w:type="spellEnd"/>
+            <w:r>
+              <w:rPr>
+                <w:lang w:val="fr-FR"/>
+              </w:rPr>
+              <w:t xml:space="preserve"> l’application </w:t>
+            </w:r>
           </w:p>
         </w:tc>
       </w:tr>
@@ -2921,7 +2712,7 @@
     <w:p>
       <w:pPr>
         <w:rPr>
-          <w:lang w:val="en-US"/>
+          <w:lang w:val="fr-FR"/>
         </w:rPr>
       </w:pPr>
     </w:p>
@@ -2932,7 +2723,6 @@
           <w:bCs/>
           <w:sz w:val="28"/>
           <w:szCs w:val="28"/>
-          <w:lang w:val="en-US"/>
         </w:rPr>
       </w:pPr>
       <w:r>
@@ -2941,7 +2731,6 @@
           <w:bCs/>
           <w:sz w:val="28"/>
           <w:szCs w:val="28"/>
-          <w:lang w:val="en-US"/>
         </w:rPr>
         <w:t xml:space="preserve">Grille de </w:t>
       </w:r>
@@ -2951,7 +2740,6 @@
           <w:bCs/>
           <w:sz w:val="28"/>
           <w:szCs w:val="28"/>
-          <w:lang w:val="en-US"/>
         </w:rPr>
         <w:t>decision</w:t>
       </w:r>
@@ -2961,14 +2749,12 @@
         <w:rPr>
           <w:b/>
           <w:bCs/>
-          <w:lang w:val="en-US"/>
-        </w:rPr>
-      </w:pPr>
-      <w:r>
-        <w:rPr>
-          <w:b/>
-          <w:bCs/>
-          <w:lang w:val="en-US"/>
+        </w:rPr>
+      </w:pPr>
+      <w:r>
+        <w:rPr>
+          <w:b/>
+          <w:bCs/>
         </w:rPr>
         <w:t>Classification des anomalies</w:t>
       </w:r>
@@ -2983,178 +2769,42 @@
         <w:rPr>
           <w:b/>
           <w:bCs/>
-          <w:lang w:val="en-US"/>
-        </w:rPr>
-      </w:pPr>
-      <w:r>
-        <w:rPr>
-          <w:b/>
-          <w:bCs/>
-          <w:lang w:val="en-US"/>
-        </w:rPr>
-        <w:t>Critique</w:t>
-      </w:r>
-      <w:r>
-        <w:rPr>
-          <w:b/>
-          <w:bCs/>
-          <w:lang w:val="en-US"/>
-        </w:rPr>
-        <w:t>:</w:t>
-      </w:r>
-      <w:r>
-        <w:rPr>
-          <w:b/>
-          <w:bCs/>
-          <w:lang w:val="en-US"/>
+          <w:lang w:val="fr-FR"/>
+        </w:rPr>
+      </w:pPr>
+      <w:r>
+        <w:rPr>
+          <w:b/>
+          <w:bCs/>
+          <w:lang w:val="fr-FR"/>
+        </w:rPr>
+        <w:t>Critique:</w:t>
+      </w:r>
+      <w:r>
+        <w:rPr>
+          <w:b/>
+          <w:bCs/>
+          <w:lang w:val="fr-FR"/>
         </w:rPr>
         <w:t xml:space="preserve"> </w:t>
       </w:r>
       <w:r>
         <w:rPr>
-          <w:lang w:val="en-US"/>
-        </w:rPr>
-        <w:t xml:space="preserve">Bloque </w:t>
-      </w:r>
-      <w:proofErr w:type="spellStart"/>
-      <w:r>
-        <w:rPr>
-          <w:lang w:val="en-US"/>
-        </w:rPr>
-        <w:t>l’utilisateur</w:t>
-      </w:r>
-      <w:proofErr w:type="spellEnd"/>
-      <w:r>
-        <w:rPr>
-          <w:lang w:val="en-US"/>
-        </w:rPr>
-        <w:t xml:space="preserve"> sur la page de </w:t>
-      </w:r>
-      <w:proofErr w:type="spellStart"/>
-      <w:r>
-        <w:rPr>
-          <w:lang w:val="en-US"/>
-        </w:rPr>
-        <w:t>connexion</w:t>
-      </w:r>
-      <w:proofErr w:type="spellEnd"/>
-      <w:r>
-        <w:rPr>
-          <w:lang w:val="en-US"/>
-        </w:rPr>
-        <w:t xml:space="preserve"> </w:t>
-      </w:r>
-      <w:proofErr w:type="spellStart"/>
-      <w:r>
-        <w:rPr>
-          <w:lang w:val="en-US"/>
-        </w:rPr>
-        <w:t>même</w:t>
-      </w:r>
-      <w:proofErr w:type="spellEnd"/>
-      <w:r>
-        <w:rPr>
-          <w:lang w:val="en-US"/>
-        </w:rPr>
-        <w:t xml:space="preserve"> </w:t>
-      </w:r>
-      <w:proofErr w:type="spellStart"/>
-      <w:r>
-        <w:rPr>
-          <w:lang w:val="en-US"/>
-        </w:rPr>
-        <w:t>si</w:t>
-      </w:r>
-      <w:proofErr w:type="spellEnd"/>
-      <w:r>
-        <w:rPr>
-          <w:lang w:val="en-US"/>
-        </w:rPr>
-        <w:t xml:space="preserve"> </w:t>
-      </w:r>
-      <w:proofErr w:type="spellStart"/>
-      <w:r>
-        <w:rPr>
-          <w:lang w:val="en-US"/>
-        </w:rPr>
-        <w:t>l’identifiant</w:t>
-      </w:r>
-      <w:proofErr w:type="spellEnd"/>
-      <w:r>
-        <w:rPr>
-          <w:lang w:val="en-US"/>
-        </w:rPr>
-        <w:t xml:space="preserve"> est </w:t>
-      </w:r>
-      <w:proofErr w:type="spellStart"/>
-      <w:r>
-        <w:rPr>
-          <w:lang w:val="en-US"/>
-        </w:rPr>
-        <w:t>correcte</w:t>
-      </w:r>
-      <w:proofErr w:type="spellEnd"/>
-      <w:r>
-        <w:rPr>
-          <w:lang w:val="en-US"/>
-        </w:rPr>
-        <w:t xml:space="preserve"> </w:t>
-      </w:r>
-      <w:proofErr w:type="spellStart"/>
-      <w:r>
-        <w:rPr>
-          <w:lang w:val="en-US"/>
-        </w:rPr>
-        <w:t>mais</w:t>
-      </w:r>
-      <w:proofErr w:type="spellEnd"/>
-      <w:r>
-        <w:rPr>
-          <w:lang w:val="en-US"/>
-        </w:rPr>
-        <w:t xml:space="preserve"> </w:t>
-      </w:r>
-      <w:proofErr w:type="spellStart"/>
-      <w:r>
-        <w:rPr>
-          <w:lang w:val="en-US"/>
-        </w:rPr>
-        <w:t>si</w:t>
-      </w:r>
-      <w:proofErr w:type="spellEnd"/>
-      <w:r>
-        <w:rPr>
-          <w:lang w:val="en-US"/>
-        </w:rPr>
-        <w:t xml:space="preserve"> on charge la page </w:t>
-      </w:r>
-      <w:proofErr w:type="spellStart"/>
-      <w:r>
-        <w:rPr>
-          <w:lang w:val="en-US"/>
-        </w:rPr>
-        <w:t>l’utilisateur</w:t>
-      </w:r>
-      <w:proofErr w:type="spellEnd"/>
-      <w:r>
-        <w:rPr>
-          <w:lang w:val="en-US"/>
-        </w:rPr>
-        <w:t xml:space="preserve"> sera </w:t>
-      </w:r>
-      <w:proofErr w:type="spellStart"/>
-      <w:r>
-        <w:rPr>
-          <w:lang w:val="en-US"/>
-        </w:rPr>
-        <w:t>diriger</w:t>
-      </w:r>
-      <w:proofErr w:type="spellEnd"/>
-      <w:r>
-        <w:rPr>
-          <w:lang w:val="en-US"/>
-        </w:rPr>
-        <w:t xml:space="preserve"> vers le tableau de bord.</w:t>
+          <w:lang w:val="fr-FR"/>
+        </w:rPr>
+        <w:t xml:space="preserve">Bloque l’utilisateur sur la page de connexion même si l’identifiant est </w:t>
+      </w:r>
+      <w:r>
+        <w:rPr>
+          <w:lang w:val="fr-FR"/>
+        </w:rPr>
+        <w:t>correct</w:t>
+      </w:r>
+      <w:r>
+        <w:rPr>
+          <w:lang w:val="fr-FR"/>
+        </w:rPr>
+        <w:t xml:space="preserve"> mais si on charge la page l’utilisateur sera diriger vers le tableau de bord.</w:t>
       </w:r>
     </w:p>
     <w:p>
@@ -3167,130 +2817,52 @@
         <w:rPr>
           <w:b/>
           <w:bCs/>
-          <w:lang w:val="en-US"/>
-        </w:rPr>
-      </w:pPr>
-      <w:r>
-        <w:rPr>
-          <w:b/>
-          <w:bCs/>
-          <w:lang w:val="en-US"/>
+          <w:lang w:val="fr-FR"/>
+        </w:rPr>
+      </w:pPr>
+      <w:r>
+        <w:rPr>
+          <w:b/>
+          <w:bCs/>
+          <w:lang w:val="fr-FR"/>
         </w:rPr>
         <w:t xml:space="preserve">Majeure: </w:t>
       </w:r>
       <w:r>
         <w:rPr>
-          <w:lang w:val="en-US"/>
-        </w:rPr>
-        <w:t xml:space="preserve">les </w:t>
-      </w:r>
-      <w:proofErr w:type="spellStart"/>
-      <w:r>
-        <w:rPr>
-          <w:lang w:val="en-US"/>
-        </w:rPr>
-        <w:t>montants</w:t>
-      </w:r>
-      <w:proofErr w:type="spellEnd"/>
-      <w:r>
-        <w:rPr>
-          <w:lang w:val="en-US"/>
+          <w:lang w:val="fr-FR"/>
+        </w:rPr>
+        <w:t>les montants négatifs sont acceptés lors de l’inser</w:t>
+      </w:r>
+      <w:r>
+        <w:rPr>
+          <w:lang w:val="fr-FR"/>
+        </w:rPr>
+        <w:t>t</w:t>
+      </w:r>
+      <w:r>
+        <w:rPr>
+          <w:lang w:val="fr-FR"/>
+        </w:rPr>
+        <w:t>ion</w:t>
+      </w:r>
+      <w:r>
+        <w:rPr>
+          <w:b/>
+          <w:bCs/>
+          <w:lang w:val="fr-FR"/>
         </w:rPr>
         <w:t xml:space="preserve"> </w:t>
       </w:r>
-      <w:proofErr w:type="spellStart"/>
-      <w:r>
-        <w:rPr>
-          <w:lang w:val="en-US"/>
-        </w:rPr>
-        <w:t>négatifs</w:t>
-      </w:r>
-      <w:proofErr w:type="spellEnd"/>
-      <w:r>
-        <w:rPr>
-          <w:lang w:val="en-US"/>
-        </w:rPr>
-        <w:t xml:space="preserve"> </w:t>
-      </w:r>
-      <w:proofErr w:type="spellStart"/>
-      <w:r>
-        <w:rPr>
-          <w:lang w:val="en-US"/>
-        </w:rPr>
-        <w:t>sont</w:t>
-      </w:r>
-      <w:proofErr w:type="spellEnd"/>
-      <w:r>
-        <w:rPr>
-          <w:lang w:val="en-US"/>
-        </w:rPr>
-        <w:t xml:space="preserve"> </w:t>
-      </w:r>
-      <w:proofErr w:type="spellStart"/>
-      <w:r>
-        <w:rPr>
-          <w:lang w:val="en-US"/>
-        </w:rPr>
-        <w:t>acceptés</w:t>
-      </w:r>
-      <w:proofErr w:type="spellEnd"/>
-      <w:r>
-        <w:rPr>
-          <w:lang w:val="en-US"/>
-        </w:rPr>
-        <w:t xml:space="preserve"> </w:t>
-      </w:r>
-      <w:proofErr w:type="spellStart"/>
-      <w:r>
-        <w:rPr>
-          <w:lang w:val="en-US"/>
-        </w:rPr>
-        <w:t>lors</w:t>
-      </w:r>
-      <w:proofErr w:type="spellEnd"/>
-      <w:r>
-        <w:rPr>
-          <w:lang w:val="en-US"/>
-        </w:rPr>
-        <w:t xml:space="preserve"> de </w:t>
-      </w:r>
-      <w:proofErr w:type="spellStart"/>
-      <w:r>
-        <w:rPr>
-          <w:lang w:val="en-US"/>
-        </w:rPr>
-        <w:t>l’inser</w:t>
-      </w:r>
-      <w:r>
-        <w:rPr>
-          <w:lang w:val="en-US"/>
-        </w:rPr>
-        <w:t>t</w:t>
-      </w:r>
-      <w:r>
-        <w:rPr>
-          <w:lang w:val="en-US"/>
-        </w:rPr>
-        <w:t>ion</w:t>
-      </w:r>
-      <w:proofErr w:type="spellEnd"/>
-      <w:r>
-        <w:rPr>
-          <w:b/>
-          <w:bCs/>
-          <w:lang w:val="en-US"/>
-        </w:rPr>
-        <w:t xml:space="preserve"> </w:t>
-      </w:r>
-      <w:r>
-        <w:rPr>
-          <w:lang w:val="en-US"/>
+      <w:r>
+        <w:rPr>
+          <w:lang w:val="fr-FR"/>
         </w:rPr>
         <w:t>de données</w:t>
       </w:r>
       <w:r>
         <w:rPr>
-          <w:lang w:val="en-US"/>
+          <w:lang w:val="fr-FR"/>
         </w:rPr>
         <w:t>.</w:t>
       </w:r>
@@ -3305,130 +2877,62 @@
         <w:rPr>
           <w:b/>
           <w:bCs/>
-          <w:lang w:val="en-US"/>
-        </w:rPr>
-      </w:pPr>
-      <w:proofErr w:type="spellStart"/>
-      <w:r>
-        <w:rPr>
-          <w:b/>
-          <w:bCs/>
-          <w:lang w:val="en-US"/>
-        </w:rPr>
-        <w:t>Mineure</w:t>
-      </w:r>
-      <w:proofErr w:type="spellEnd"/>
-      <w:r>
-        <w:rPr>
-          <w:b/>
-          <w:bCs/>
-          <w:lang w:val="en-US"/>
-        </w:rPr>
-        <w:t xml:space="preserve">: </w:t>
-      </w:r>
-      <w:r>
-        <w:rPr>
-          <w:lang w:val="en-US"/>
-        </w:rPr>
-        <w:t xml:space="preserve"> la </w:t>
-      </w:r>
-      <w:proofErr w:type="spellStart"/>
-      <w:r>
-        <w:rPr>
-          <w:lang w:val="en-US"/>
-        </w:rPr>
-        <w:t>courbe</w:t>
-      </w:r>
-      <w:proofErr w:type="spellEnd"/>
-      <w:r>
-        <w:rPr>
-          <w:lang w:val="en-US"/>
-        </w:rPr>
-        <w:t xml:space="preserve"> qui </w:t>
-      </w:r>
-      <w:proofErr w:type="spellStart"/>
-      <w:r>
-        <w:rPr>
-          <w:lang w:val="en-US"/>
-        </w:rPr>
-        <w:t>repr</w:t>
-      </w:r>
-      <w:r>
-        <w:rPr>
-          <w:lang w:val="en-US"/>
+          <w:lang w:val="fr-FR"/>
+        </w:rPr>
+      </w:pPr>
+      <w:r>
+        <w:rPr>
+          <w:b/>
+          <w:bCs/>
+          <w:lang w:val="fr-FR"/>
+        </w:rPr>
+        <w:t xml:space="preserve">Mineure: </w:t>
+      </w:r>
+      <w:r>
+        <w:rPr>
+          <w:lang w:val="fr-FR"/>
+        </w:rPr>
+        <w:t xml:space="preserve"> la courbe qui repr</w:t>
+      </w:r>
+      <w:r>
+        <w:rPr>
+          <w:lang w:val="fr-FR"/>
         </w:rPr>
         <w:t>é</w:t>
       </w:r>
       <w:r>
         <w:rPr>
-          <w:lang w:val="en-US"/>
-        </w:rPr>
-        <w:t>sente</w:t>
-      </w:r>
-      <w:proofErr w:type="spellEnd"/>
-      <w:r>
-        <w:rPr>
-          <w:lang w:val="en-US"/>
-        </w:rPr>
-        <w:t xml:space="preserve"> </w:t>
-      </w:r>
-      <w:proofErr w:type="spellStart"/>
-      <w:r>
-        <w:rPr>
-          <w:lang w:val="en-US"/>
-        </w:rPr>
-        <w:t>tous</w:t>
-      </w:r>
-      <w:proofErr w:type="spellEnd"/>
-      <w:r>
-        <w:rPr>
-          <w:lang w:val="en-US"/>
-        </w:rPr>
-        <w:t xml:space="preserve"> les transaction</w:t>
-      </w:r>
-      <w:r>
-        <w:rPr>
-          <w:lang w:val="en-US"/>
+          <w:lang w:val="fr-FR"/>
+        </w:rPr>
+        <w:t>sente tous les transaction</w:t>
+      </w:r>
+      <w:r>
+        <w:rPr>
+          <w:lang w:val="fr-FR"/>
         </w:rPr>
         <w:t>s</w:t>
       </w:r>
       <w:r>
         <w:rPr>
-          <w:lang w:val="en-US"/>
-        </w:rPr>
-        <w:t xml:space="preserve"> ne </w:t>
-      </w:r>
-      <w:proofErr w:type="spellStart"/>
-      <w:r>
-        <w:rPr>
-          <w:lang w:val="en-US"/>
-        </w:rPr>
-        <w:t>marche</w:t>
-      </w:r>
-      <w:r>
-        <w:rPr>
-          <w:lang w:val="en-US"/>
+          <w:lang w:val="fr-FR"/>
+        </w:rPr>
+        <w:t xml:space="preserve"> ne marche</w:t>
+      </w:r>
+      <w:r>
+        <w:rPr>
+          <w:lang w:val="fr-FR"/>
         </w:rPr>
         <w:t>nt</w:t>
       </w:r>
-      <w:proofErr w:type="spellEnd"/>
-      <w:r>
-        <w:rPr>
-          <w:lang w:val="en-US"/>
-        </w:rPr>
-        <w:t xml:space="preserve"> pas </w:t>
-      </w:r>
-      <w:proofErr w:type="spellStart"/>
-      <w:r>
-        <w:rPr>
-          <w:lang w:val="en-US"/>
-        </w:rPr>
-        <w:t>correctement</w:t>
-      </w:r>
-      <w:proofErr w:type="spellEnd"/>
-      <w:r>
-        <w:rPr>
-          <w:lang w:val="en-US"/>
+      <w:r>
+        <w:rPr>
+          <w:lang w:val="fr-FR"/>
+        </w:rPr>
+        <w:t xml:space="preserve"> pas correctement</w:t>
+      </w:r>
+      <w:r>
+        <w:rPr>
+          <w:lang w:val="fr-FR"/>
         </w:rPr>
         <w:t>.</w:t>
       </w:r>
@@ -3436,7 +2940,7 @@
     <w:p>
       <w:pPr>
         <w:rPr>
-          <w:lang w:val="en-US"/>
+          <w:lang w:val="fr-FR"/>
         </w:rPr>
       </w:pPr>
     </w:p>
@@ -3451,7 +2955,7 @@
 </file>
 
 <file path=word/numbering.xml><?xml version="1.0" encoding="utf-8"?>
-<w:numbering xmlns:wpc="http://schemas.microsoft.com/office/word/2010/wordprocessingCanvas" xmlns:cx="http://schemas.microsoft.com/office/drawing/2014/chartex" xmlns:cx1="http://schemas.microsoft.com/office/drawing/2015/9/8/chartex" xmlns:cx2="http://schemas.microsoft.com/office/drawing/2015/10/21/chartex" xmlns:cx3="http://schemas.microsoft.com/office/drawing/2016/5/9/chartex" xmlns:cx4="http://schemas.microsoft.com/office/drawing/2016/5/10/chartex" xmlns:cx5="http://schemas.microsoft.com/office/drawing/2016/5/11/chartex" xmlns:cx6="http://schemas.microsoft.com/office/drawing/2016/5/12/chartex" xmlns:cx7="http://schemas.microsoft.com/office/drawing/2016/5/13/chartex" xmlns:cx8="http://schemas.microsoft.com/office/drawing/2016/5/14/chartex" xmlns:mc="http://schemas.openxmlformats.org/markup-compatibility/2006" xmlns:aink="http://schemas.microsoft.com/office/drawing/2016/ink" xmlns:am3d="http://schemas.microsoft.com/office/drawing/2017/model3d" xmlns:o="urn:schemas-microsoft-com:office:office" xmlns:oel="http://schemas.microsoft.com/office/2019/extlst" xmlns:r="http://schemas.openxmlformats.org/officeDocument/2006/relationships" xmlns:m="http://schemas.openxmlformats.org/officeDocument/2006/math" xmlns:v="urn:schemas-microsoft-com:vml" xmlns:wp14="http://schemas.microsoft.com/office/word/2010/wordprocessingDrawing" xmlns:wp="http://schemas.openxmlformats.org/drawingml/2006/wordprocessingDrawing" xmlns:w10="urn:schemas-microsoft-com:office:word" xmlns:w="http://schemas.openxmlformats.org/wordprocessingml/2006/main" xmlns:w14="http://schemas.microsoft.com/office/word/2010/wordml" xmlns:w15="http://schemas.microsoft.com/office/word/2012/wordml" xmlns:w16cex="http://schemas.microsoft.com/office/word/2018/wordml/cex" xmlns:w16cid="http://schemas.microsoft.com/office/word/2016/wordml/cid" xmlns:w16="http://schemas.microsoft.com/office/word/2018/wordml" xmlns:w16du="http://schemas.microsoft.com/office/word/2023/wordml/word16du" xmlns:w16sdtdh="http://schemas.microsoft.com/office/word/2020/wordml/sdtdatahash" xmlns:w16sdtfl="http://schemas.microsoft.com/office/word/2024/wordml/sdtformatlock" xmlns:w16se="http://schemas.microsoft.com/office/word/2015/wordml/symex" xmlns:wpg="http://schemas.microsoft.com/office/word/2010/wordprocessingGroup" xmlns:wpi="http://schemas.microsoft.com/office/word/2010/wordprocessingInk" xmlns:wne="http://schemas.microsoft.com/office/word/2006/wordml" xmlns:wps="http://schemas.microsoft.com/office/word/2010/wordprocessingShape" mc:Ignorable="w14 w15 w16se w16cid w16 w16cex w16sdtdh w16sdtfl w16du wp14">
+<w:numbering xmlns:wpc="http://schemas.microsoft.com/office/word/2010/wordprocessingCanvas" xmlns:cx="http://schemas.microsoft.com/office/drawing/2014/chartex" xmlns:cx1="http://schemas.microsoft.com/office/drawing/2015/9/8/chartex" xmlns:mc="http://schemas.openxmlformats.org/markup-compatibility/2006" xmlns:o="urn:schemas-microsoft-com:office:office" xmlns:r="http://schemas.openxmlformats.org/officeDocument/2006/relationships" xmlns:m="http://schemas.openxmlformats.org/officeDocument/2006/math" xmlns:v="urn:schemas-microsoft-com:vml" xmlns:wp14="http://schemas.microsoft.com/office/word/2010/wordprocessingDrawing" xmlns:wp="http://schemas.openxmlformats.org/drawingml/2006/wordprocessingDrawing" xmlns:w10="urn:schemas-microsoft-com:office:word" xmlns:w="http://schemas.openxmlformats.org/wordprocessingml/2006/main" xmlns:w14="http://schemas.microsoft.com/office/word/2010/wordml" xmlns:w15="http://schemas.microsoft.com/office/word/2012/wordml" xmlns:w16se="http://schemas.microsoft.com/office/word/2015/wordml/symex" xmlns:wpg="http://schemas.microsoft.com/office/word/2010/wordprocessingGroup" xmlns:wpi="http://schemas.microsoft.com/office/word/2010/wordprocessingInk" xmlns:wne="http://schemas.microsoft.com/office/word/2006/wordml" xmlns:wps="http://schemas.microsoft.com/office/word/2010/wordprocessingShape" mc:Ignorable="w14 w15 w16se wp14">
   <w:abstractNum w:abstractNumId="0" w15:restartNumberingAfterBreak="0">
     <w:nsid w:val="07C13625"/>
     <w:multiLevelType w:val="multilevel"/>
@@ -4388,6 +3892,119 @@
     </w:lvl>
   </w:abstractNum>
   <w:abstractNum w:abstractNumId="7" w15:restartNumberingAfterBreak="0">
+    <w:nsid w:val="4BFB3253"/>
+    <w:multiLevelType w:val="hybridMultilevel"/>
+    <w:tmpl w:val="974CD200"/>
+    <w:lvl w:ilvl="0" w:tplc="04090001">
+      <w:start w:val="1"/>
+      <w:numFmt w:val="bullet"/>
+      <w:lvlText w:val=""/>
+      <w:lvlJc w:val="left"/>
+      <w:pPr>
+        <w:ind w:left="720" w:hanging="360"/>
+      </w:pPr>
+      <w:rPr>
+        <w:rFonts w:ascii="Symbol" w:hAnsi="Symbol" w:hint="default"/>
+      </w:rPr>
+    </w:lvl>
+    <w:lvl w:ilvl="1" w:tplc="04090003" w:tentative="1">
+      <w:start w:val="1"/>
+      <w:numFmt w:val="bullet"/>
+      <w:lvlText w:val="o"/>
+      <w:lvlJc w:val="left"/>
+      <w:pPr>
+        <w:ind w:left="1440" w:hanging="360"/>
+      </w:pPr>
+      <w:rPr>
+        <w:rFonts w:ascii="Courier New" w:hAnsi="Courier New" w:cs="Courier New" w:hint="default"/>
+      </w:rPr>
+    </w:lvl>
+    <w:lvl w:ilvl="2" w:tplc="04090005" w:tentative="1">
+      <w:start w:val="1"/>
+      <w:numFmt w:val="bullet"/>
+      <w:lvlText w:val=""/>
+      <w:lvlJc w:val="left"/>
+      <w:pPr>
+        <w:ind w:left="2160" w:hanging="360"/>
+      </w:pPr>
+      <w:rPr>
+        <w:rFonts w:ascii="Wingdings" w:hAnsi="Wingdings" w:hint="default"/>
+      </w:rPr>
+    </w:lvl>
+    <w:lvl w:ilvl="3" w:tplc="04090001" w:tentative="1">
+      <w:start w:val="1"/>
+      <w:numFmt w:val="bullet"/>
+      <w:lvlText w:val=""/>
+      <w:lvlJc w:val="left"/>
+      <w:pPr>
+        <w:ind w:left="2880" w:hanging="360"/>
+      </w:pPr>
+      <w:rPr>
+        <w:rFonts w:ascii="Symbol" w:hAnsi="Symbol" w:hint="default"/>
+      </w:rPr>
+    </w:lvl>
+    <w:lvl w:ilvl="4" w:tplc="04090003" w:tentative="1">
+      <w:start w:val="1"/>
+      <w:numFmt w:val="bullet"/>
+      <w:lvlText w:val="o"/>
+      <w:lvlJc w:val="left"/>
+      <w:pPr>
+        <w:ind w:left="3600" w:hanging="360"/>
+      </w:pPr>
+      <w:rPr>
+        <w:rFonts w:ascii="Courier New" w:hAnsi="Courier New" w:cs="Courier New" w:hint="default"/>
+      </w:rPr>
+    </w:lvl>
+    <w:lvl w:ilvl="5" w:tplc="04090005" w:tentative="1">
+      <w:start w:val="1"/>
+      <w:numFmt w:val="bullet"/>
+      <w:lvlText w:val=""/>
+      <w:lvlJc w:val="left"/>
+      <w:pPr>
+        <w:ind w:left="4320" w:hanging="360"/>
+      </w:pPr>
+      <w:rPr>
+        <w:rFonts w:ascii="Wingdings" w:hAnsi="Wingdings" w:hint="default"/>
+      </w:rPr>
+    </w:lvl>
+    <w:lvl w:ilvl="6" w:tplc="04090001" w:tentative="1">
+      <w:start w:val="1"/>
+      <w:numFmt w:val="bullet"/>
+      <w:lvlText w:val=""/>
+      <w:lvlJc w:val="left"/>
+      <w:pPr>
+        <w:ind w:left="5040" w:hanging="360"/>
+      </w:pPr>
+      <w:rPr>
+        <w:rFonts w:ascii="Symbol" w:hAnsi="Symbol" w:hint="default"/>
+      </w:rPr>
+    </w:lvl>
+    <w:lvl w:ilvl="7" w:tplc="04090003" w:tentative="1">
+      <w:start w:val="1"/>
+      <w:numFmt w:val="bullet"/>
+      <w:lvlText w:val="o"/>
+      <w:lvlJc w:val="left"/>
+      <w:pPr>
+        <w:ind w:left="5760" w:hanging="360"/>
+      </w:pPr>
+      <w:rPr>
+        <w:rFonts w:ascii="Courier New" w:hAnsi="Courier New" w:cs="Courier New" w:hint="default"/>
+      </w:rPr>
+    </w:lvl>
+    <w:lvl w:ilvl="8" w:tplc="04090005" w:tentative="1">
+      <w:start w:val="1"/>
+      <w:numFmt w:val="bullet"/>
+      <w:lvlText w:val=""/>
+      <w:lvlJc w:val="left"/>
+      <w:pPr>
+        <w:ind w:left="6480" w:hanging="360"/>
+      </w:pPr>
+      <w:rPr>
+        <w:rFonts w:ascii="Wingdings" w:hAnsi="Wingdings" w:hint="default"/>
+      </w:rPr>
+    </w:lvl>
+  </w:abstractNum>
+  <w:abstractNum w:abstractNumId="8" w15:restartNumberingAfterBreak="0">
     <w:nsid w:val="4FD853CC"/>
     <w:multiLevelType w:val="hybridMultilevel"/>
     <w:tmpl w:val="22F474D6"/>
@@ -4500,7 +4117,7 @@
       </w:rPr>
     </w:lvl>
   </w:abstractNum>
-  <w:abstractNum w:abstractNumId="8" w15:restartNumberingAfterBreak="0">
+  <w:abstractNum w:abstractNumId="9" w15:restartNumberingAfterBreak="0">
     <w:nsid w:val="68D876CD"/>
     <w:multiLevelType w:val="hybridMultilevel"/>
     <w:tmpl w:val="D4C88762"/>
@@ -4613,7 +4230,7 @@
       </w:rPr>
     </w:lvl>
   </w:abstractNum>
-  <w:abstractNum w:abstractNumId="9" w15:restartNumberingAfterBreak="0">
+  <w:abstractNum w:abstractNumId="10" w15:restartNumberingAfterBreak="0">
     <w:nsid w:val="71267FA0"/>
     <w:multiLevelType w:val="hybridMultilevel"/>
     <w:tmpl w:val="FB20848C"/>
@@ -4699,7 +4316,7 @@
       </w:pPr>
     </w:lvl>
   </w:abstractNum>
-  <w:abstractNum w:abstractNumId="10" w15:restartNumberingAfterBreak="0">
+  <w:abstractNum w:abstractNumId="11" w15:restartNumberingAfterBreak="0">
     <w:nsid w:val="7D4C1532"/>
     <w:multiLevelType w:val="multilevel"/>
     <w:tmpl w:val="B9D8296C"/>
@@ -4848,44 +4465,47 @@
       </w:rPr>
     </w:lvl>
   </w:abstractNum>
-  <w:num w:numId="1" w16cid:durableId="605313497">
+  <w:num w:numId="1">
     <w:abstractNumId w:val="5"/>
   </w:num>
-  <w:num w:numId="2" w16cid:durableId="1843273641">
+  <w:num w:numId="2">
     <w:abstractNumId w:val="1"/>
   </w:num>
-  <w:num w:numId="3" w16cid:durableId="1847934516">
+  <w:num w:numId="3">
     <w:abstractNumId w:val="0"/>
   </w:num>
-  <w:num w:numId="4" w16cid:durableId="1823546089">
+  <w:num w:numId="4">
     <w:abstractNumId w:val="4"/>
   </w:num>
-  <w:num w:numId="5" w16cid:durableId="1259486797">
+  <w:num w:numId="5">
+    <w:abstractNumId w:val="11"/>
+  </w:num>
+  <w:num w:numId="6">
+    <w:abstractNumId w:val="9"/>
+  </w:num>
+  <w:num w:numId="7">
+    <w:abstractNumId w:val="6"/>
+  </w:num>
+  <w:num w:numId="8">
+    <w:abstractNumId w:val="3"/>
+  </w:num>
+  <w:num w:numId="9">
+    <w:abstractNumId w:val="2"/>
+  </w:num>
+  <w:num w:numId="10">
     <w:abstractNumId w:val="10"/>
   </w:num>
-  <w:num w:numId="6" w16cid:durableId="381440187">
+  <w:num w:numId="11">
     <w:abstractNumId w:val="8"/>
   </w:num>
-  <w:num w:numId="7" w16cid:durableId="766970334">
-    <w:abstractNumId w:val="6"/>
-  </w:num>
-  <w:num w:numId="8" w16cid:durableId="1067727686">
-    <w:abstractNumId w:val="3"/>
-  </w:num>
-  <w:num w:numId="9" w16cid:durableId="1141118374">
-    <w:abstractNumId w:val="2"/>
-  </w:num>
-  <w:num w:numId="10" w16cid:durableId="434636722">
-    <w:abstractNumId w:val="9"/>
-  </w:num>
-  <w:num w:numId="11" w16cid:durableId="183129855">
+  <w:num w:numId="12">
     <w:abstractNumId w:val="7"/>
   </w:num>
 </w:numbering>
 </file>
 
 <file path=word/styles.xml><?xml version="1.0" encoding="utf-8"?>
-<w:styles xmlns:mc="http://schemas.openxmlformats.org/markup-compatibility/2006" xmlns:r="http://schemas.openxmlformats.org/officeDocument/2006/relationships" xmlns:w="http://schemas.openxmlformats.org/wordprocessingml/2006/main" xmlns:w14="http://schemas.microsoft.com/office/word/2010/wordml" xmlns:w15="http://schemas.microsoft.com/office/word/2012/wordml" xmlns:w16cex="http://schemas.microsoft.com/office/word/2018/wordml/cex" xmlns:w16cid="http://schemas.microsoft.com/office/word/2016/wordml/cid" xmlns:w16="http://schemas.microsoft.com/office/word/2018/wordml" xmlns:w16du="http://schemas.microsoft.com/office/word/2023/wordml/word16du" xmlns:w16sdtdh="http://schemas.microsoft.com/office/word/2020/wordml/sdtdatahash" xmlns:w16sdtfl="http://schemas.microsoft.com/office/word/2024/wordml/sdtformatlock" xmlns:w16se="http://schemas.microsoft.com/office/word/2015/wordml/symex" mc:Ignorable="w14 w15 w16se w16cid w16 w16cex w16sdtdh w16sdtfl w16du">
+<w:styles xmlns:mc="http://schemas.openxmlformats.org/markup-compatibility/2006" xmlns:r="http://schemas.openxmlformats.org/officeDocument/2006/relationships" xmlns:w="http://schemas.openxmlformats.org/wordprocessingml/2006/main" xmlns:w14="http://schemas.microsoft.com/office/word/2010/wordml" xmlns:w15="http://schemas.microsoft.com/office/word/2012/wordml" xmlns:w16se="http://schemas.microsoft.com/office/word/2015/wordml/symex" mc:Ignorable="w14 w15 w16se">
   <w:docDefaults>
     <w:rPrDefault>
       <w:rPr>
@@ -4893,7 +4513,7 @@
         <w:kern w:val="2"/>
         <w:sz w:val="24"/>
         <w:szCs w:val="24"/>
-        <w:lang w:eastAsia="en-US" w:bidi="ar-SA"/>
+        <w:lang w:val="en-US" w:eastAsia="en-US" w:bidi="ar-SA"/>
         <w14:ligatures w14:val="standardContextual"/>
       </w:rPr>
     </w:rPrDefault>
@@ -4903,7 +4523,7 @@
       </w:pPr>
     </w:pPrDefault>
   </w:docDefaults>
-  <w:latentStyles w:defLockedState="0" w:defUIPriority="99" w:defSemiHidden="0" w:defUnhideWhenUsed="0" w:defQFormat="0" w:count="376">
+  <w:latentStyles w:defLockedState="0" w:defUIPriority="99" w:defSemiHidden="0" w:defUnhideWhenUsed="0" w:defQFormat="0" w:count="371">
     <w:lsdException w:name="Normal" w:uiPriority="0" w:qFormat="1"/>
     <w:lsdException w:name="heading 1" w:uiPriority="9" w:qFormat="1"/>
     <w:lsdException w:name="heading 2" w:semiHidden="1" w:uiPriority="9" w:unhideWhenUsed="1" w:qFormat="1"/>
@@ -5275,11 +4895,6 @@
     <w:lsdException w:name="List Table 5 Dark Accent 6" w:uiPriority="50"/>
     <w:lsdException w:name="List Table 6 Colorful Accent 6" w:uiPriority="51"/>
     <w:lsdException w:name="List Table 7 Colorful Accent 6" w:uiPriority="52"/>
-    <w:lsdException w:name="Mention" w:semiHidden="1" w:unhideWhenUsed="1"/>
-    <w:lsdException w:name="Smart Hyperlink" w:semiHidden="1" w:unhideWhenUsed="1"/>
-    <w:lsdException w:name="Hashtag" w:semiHidden="1" w:unhideWhenUsed="1"/>
-    <w:lsdException w:name="Unresolved Mention" w:semiHidden="1" w:unhideWhenUsed="1"/>
-    <w:lsdException w:name="Smart Link" w:semiHidden="1" w:unhideWhenUsed="1"/>
   </w:latentStyles>
   <w:style w:type="paragraph" w:default="1" w:styleId="Normal">
     <w:name w:val="Normal"/>
@@ -5485,6 +5100,7 @@
   <w:style w:type="character" w:default="1" w:styleId="DefaultParagraphFont">
     <w:name w:val="Default Paragraph Font"/>
     <w:uiPriority w:val="1"/>
+    <w:semiHidden/>
     <w:unhideWhenUsed/>
   </w:style>
   <w:style w:type="table" w:default="1" w:styleId="TableNormal">

</xml_diff>